<commit_message>
completed claude and chatgpt in the written part
</commit_message>
<xml_diff>
--- a/INFO2222-ProjectTemplate-P1.docx
+++ b/INFO2222-ProjectTemplate-P1.docx
@@ -1497,15 +1497,35 @@
             </w:tcMar>
           </w:tcPr>
           <w:p>
+            <w:pPr>
+              <w:rPr>
+                <w:u w:val="single"/>
+              </w:rPr>
+            </w:pPr>
             <w:hyperlink r:id="rId9" w:history="1">
               <w:r>
                 <w:rPr>
-                  <w:rFonts w:ascii="AppleSystemUIFont" w:hAnsi="AppleSystemUIFont" w:cs="AppleSystemUIFont"/>
-                  <w:sz w:val="26"/>
-                  <w:szCs w:val="26"/>
+                  <w:color w:val="4472C4" w:themeColor="accent1"/>
+                  <w:u w:val="single"/>
                   <w:lang w:val="en-GB" w:eastAsia="zh-CN"/>
                 </w:rPr>
-                <w:t>https://chatgpt.com</w:t>
+                <w:t>htt</w:t>
+              </w:r>
+              <w:r>
+                <w:rPr>
+                  <w:color w:val="4472C4" w:themeColor="accent1"/>
+                  <w:u w:val="single"/>
+                  <w:lang w:val="en-GB" w:eastAsia="zh-CN"/>
+                </w:rPr>
+                <w:t>p</w:t>
+              </w:r>
+              <w:r>
+                <w:rPr>
+                  <w:color w:val="4472C4" w:themeColor="accent1"/>
+                  <w:u w:val="single"/>
+                  <w:lang w:val="en-GB" w:eastAsia="zh-CN"/>
+                </w:rPr>
+                <w:t>s://chatgpt.com</w:t>
               </w:r>
             </w:hyperlink>
           </w:p>
@@ -1576,20 +1596,41 @@
             </w:tcMar>
           </w:tcPr>
           <w:p>
+            <w:pPr>
+              <w:rPr>
+                <w:u w:val="single"/>
+              </w:rPr>
+            </w:pPr>
             <w:hyperlink r:id="rId10" w:history="1">
               <w:r>
                 <w:rPr>
-                  <w:rFonts w:ascii="AppleSystemUIFont" w:hAnsi="AppleSystemUIFont" w:cs="AppleSystemUIFont"/>
-                  <w:sz w:val="26"/>
-                  <w:szCs w:val="26"/>
+                  <w:color w:val="4472C4" w:themeColor="accent1"/>
+                  <w:u w:val="single"/>
                   <w:lang w:val="en-GB" w:eastAsia="zh-CN"/>
                 </w:rPr>
-                <w:t>https://claude.ai</w:t>
+                <w:t>https://claude.</w:t>
+              </w:r>
+              <w:r>
+                <w:rPr>
+                  <w:color w:val="4472C4" w:themeColor="accent1"/>
+                  <w:u w:val="single"/>
+                  <w:lang w:val="en-GB" w:eastAsia="zh-CN"/>
+                </w:rPr>
+                <w:t>a</w:t>
+              </w:r>
+              <w:r>
+                <w:rPr>
+                  <w:color w:val="4472C4" w:themeColor="accent1"/>
+                  <w:u w:val="single"/>
+                  <w:lang w:val="en-GB" w:eastAsia="zh-CN"/>
+                </w:rPr>
+                <w:t>i</w:t>
               </w:r>
             </w:hyperlink>
             <w:r>
               <w:rPr>
-                <w:rFonts w:ascii="AppleSystemUIFont" w:hAnsi="AppleSystemUIFont"/>
+                <w:color w:val="4472C4" w:themeColor="accent1"/>
+                <w:u w:val="single"/>
                 <w:lang w:val="en-GB" w:eastAsia="zh-CN"/>
               </w:rPr>
               <w:t xml:space="preserve"> </w:t>
@@ -2177,9 +2218,8 @@
                   <w14:miter w14:lim="400000"/>
                 </w14:textOutline>
               </w:rPr>
-              <w:t xml:space="preserve">- Clean design and details, editable </w:t>
-            </w:r>
-            <w:proofErr w:type="gramStart"/>
+              <w:t>- Clean design and details, editable elements</w:t>
+            </w:r>
             <w:r>
               <w:rPr>
                 <w:rStyle w:val="None"/>
@@ -2189,9 +2229,8 @@
                   <w14:miter w14:lim="400000"/>
                 </w14:textOutline>
               </w:rPr>
-              <w:t>elements(</w:t>
-            </w:r>
-            <w:proofErr w:type="gramEnd"/>
+              <w:t xml:space="preserve"> </w:t>
+            </w:r>
             <w:r>
               <w:rPr>
                 <w:rStyle w:val="None"/>
@@ -2201,7 +2240,7 @@
                   <w14:miter w14:lim="400000"/>
                 </w14:textOutline>
               </w:rPr>
-              <w:t xml:space="preserve">title, name, </w:t>
+              <w:t xml:space="preserve">(title, name, </w:t>
             </w:r>
             <w:proofErr w:type="spellStart"/>
             <w:r>
@@ -2597,7 +2636,7 @@
           </w:tcPr>
           <w:p>
             <w:r>
-              <w:t>ChatGPT</w:t>
+              <w:t>Claude.ai</w:t>
             </w:r>
           </w:p>
         </w:tc>
@@ -2619,29 +2658,29 @@
           </w:tcPr>
           <w:p>
             <w:pPr>
-              <w:pStyle w:val="p1"/>
-              <w:rPr>
-                <w:rFonts w:ascii="Times New Roman" w:hAnsi="Times New Roman"/>
-                <w:sz w:val="24"/>
-                <w:szCs w:val="24"/>
-              </w:rPr>
-            </w:pPr>
-            <w:r>
-              <w:rPr>
-                <w:rFonts w:ascii="Times New Roman" w:hAnsi="Times New Roman"/>
-                <w:sz w:val="24"/>
-                <w:szCs w:val="24"/>
-              </w:rPr>
-              <w:t>-   Effective at combining all necessary features of prototyping – interface design, code and explanation of prototype functions/abilities. This makes it an efficient GenAI for generating a complete prototype.</w:t>
-            </w:r>
-          </w:p>
-          <w:p>
-            <w:r>
-              <w:t xml:space="preserve">-   Capable of generating complete user interface </w:t>
-            </w:r>
-            <w:r>
-              <w:lastRenderedPageBreak/>
-              <w:t>flows between features (dashboard, chats, etc.). As it can create and handle multi-screen/feature systems coherently, which is necessary for implementing this system.</w:t>
+              <w:pStyle w:val="ListParagraph"/>
+              <w:numPr>
+                <w:ilvl w:val="0"/>
+                <w:numId w:val="3"/>
+              </w:numPr>
+            </w:pPr>
+            <w:r>
+              <w:t xml:space="preserve">Has the ability to generate highly coherent and great quality </w:t>
+            </w:r>
+            <w:r>
+              <w:t xml:space="preserve">texts/writings. </w:t>
+            </w:r>
+          </w:p>
+          <w:p>
+            <w:pPr>
+              <w:pStyle w:val="ListParagraph"/>
+              <w:numPr>
+                <w:ilvl w:val="0"/>
+                <w:numId w:val="3"/>
+              </w:numPr>
+            </w:pPr>
+            <w:r>
+              <w:t xml:space="preserve">Effective at condensing lengthy texts into accurate summaries. This would make it useful at the Ai meeting summary feature. </w:t>
             </w:r>
           </w:p>
         </w:tc>
@@ -2663,26 +2702,26 @@
           </w:tcPr>
           <w:p>
             <w:pPr>
-              <w:pStyle w:val="p1"/>
-              <w:rPr>
-                <w:rFonts w:ascii="Times New Roman" w:hAnsi="Times New Roman"/>
-                <w:sz w:val="24"/>
-                <w:szCs w:val="24"/>
-              </w:rPr>
-            </w:pPr>
-            <w:r>
-              <w:rPr>
-                <w:rFonts w:ascii="Times New Roman" w:hAnsi="Times New Roman"/>
-                <w:sz w:val="24"/>
-                <w:szCs w:val="24"/>
-              </w:rPr>
-              <w:lastRenderedPageBreak/>
-              <w:t>-   Possibility of “hallucinating” features and functions that were not prompted or wanted. This may result in inconsistent logic and unfunctional code that is difficult to debug.</w:t>
-            </w:r>
-          </w:p>
-          <w:p>
-            <w:r>
-              <w:t>-   Lacks the ability to include visual representations to make the user interface more interactive and appealing to students. This is as it cannot produce prefect-pixel level designs.</w:t>
+              <w:pStyle w:val="ListParagraph"/>
+              <w:numPr>
+                <w:ilvl w:val="0"/>
+                <w:numId w:val="3"/>
+              </w:numPr>
+            </w:pPr>
+            <w:r>
+              <w:t>Lacks flexibility at producing necessary technical features for the prototype. It is not the best GenAi at generating interactive prototypes and application programming interfaces.</w:t>
+            </w:r>
+          </w:p>
+          <w:p>
+            <w:pPr>
+              <w:pStyle w:val="ListParagraph"/>
+              <w:numPr>
+                <w:ilvl w:val="0"/>
+                <w:numId w:val="3"/>
+              </w:numPr>
+            </w:pPr>
+            <w:r>
+              <w:t xml:space="preserve">Not design-oriented, making it lack ability to generate appealing visuals. Instead, it often uses similar generic designs and layouts without detailed prompts and ongoing feedback. </w:t>
             </w:r>
           </w:p>
         </w:tc>
@@ -2709,7 +2748,8 @@
           </w:tcPr>
           <w:p>
             <w:r>
-              <w:t>Claude.ai</w:t>
+              <w:lastRenderedPageBreak/>
+              <w:t xml:space="preserve">ChatGPT </w:t>
             </w:r>
           </w:p>
         </w:tc>
@@ -2729,7 +2769,42 @@
               <w:right w:w="80" w:type="dxa"/>
             </w:tcMar>
           </w:tcPr>
-          <w:p/>
+          <w:p>
+            <w:pPr>
+              <w:pStyle w:val="ListParagraph"/>
+              <w:numPr>
+                <w:ilvl w:val="0"/>
+                <w:numId w:val="3"/>
+              </w:numPr>
+            </w:pPr>
+            <w:r>
+              <w:rPr>
+                <w:lang w:val="en-GB" w:eastAsia="zh-CN"/>
+              </w:rPr>
+              <w:t>Effective at combining all necessary features of prototyping – interface design, code and explanation of prototype functions/abilities. This makes it an efficient GenAI for generating a complete prototype.</w:t>
+            </w:r>
+            <w:r>
+              <w:rPr>
+                <w:lang w:val="en-GB" w:eastAsia="zh-CN"/>
+              </w:rPr>
+              <w:t xml:space="preserve"> </w:t>
+            </w:r>
+          </w:p>
+          <w:p>
+            <w:pPr>
+              <w:pStyle w:val="ListParagraph"/>
+              <w:numPr>
+                <w:ilvl w:val="0"/>
+                <w:numId w:val="3"/>
+              </w:numPr>
+            </w:pPr>
+            <w:r>
+              <w:rPr>
+                <w:lang w:val="en-GB" w:eastAsia="zh-CN"/>
+              </w:rPr>
+              <w:t>Capable of generating complete user interface flows between features (dashboard, chats, etc.). As it can create and handle multi-screen/feature systems coherently, which is necessary for implementing this system.</w:t>
+            </w:r>
+          </w:p>
         </w:tc>
         <w:tc>
           <w:tcPr>
@@ -2747,7 +2822,30 @@
               <w:right w:w="80" w:type="dxa"/>
             </w:tcMar>
           </w:tcPr>
-          <w:p/>
+          <w:p>
+            <w:pPr>
+              <w:pStyle w:val="ListParagraph"/>
+              <w:numPr>
+                <w:ilvl w:val="0"/>
+                <w:numId w:val="3"/>
+              </w:numPr>
+            </w:pPr>
+            <w:r>
+              <w:t>Possibility of “hallucinating” features and functions that were not prompted or wanted. This may result in inconsistent logic and unfunctional code that is difficult to debug.</w:t>
+            </w:r>
+          </w:p>
+          <w:p>
+            <w:pPr>
+              <w:pStyle w:val="ListParagraph"/>
+              <w:numPr>
+                <w:ilvl w:val="0"/>
+                <w:numId w:val="3"/>
+              </w:numPr>
+            </w:pPr>
+            <w:r>
+              <w:t>Lacks the ability to include visual representations to make the user interface more interactive and appealing to students. This is as it cannot produce prefect-pixel level designs.</w:t>
+            </w:r>
+          </w:p>
         </w:tc>
       </w:tr>
       <w:tr>
@@ -2922,10 +3020,36 @@
     </w:p>
     <w:p>
       <w:pPr>
+        <w:rPr>
+          <w:rStyle w:val="None"/>
+          <w:rFonts w:cs="Arial Unicode MS"/>
+          <w:b/>
+          <w:bCs/>
+          <w:color w:val="000000"/>
+          <w:u w:color="000000"/>
+          <w:lang w:eastAsia="zh-CN"/>
+          <w14:textOutline w14:w="12700" w14:cap="flat" w14:cmpd="sng" w14:algn="ctr">
+            <w14:noFill/>
+            <w14:prstDash w14:val="solid"/>
+            <w14:miter w14:lim="400000"/>
+          </w14:textOutline>
+        </w:rPr>
+      </w:pPr>
+      <w:r>
+        <w:rPr>
+          <w:rStyle w:val="None"/>
+          <w:b/>
+          <w:bCs/>
+        </w:rPr>
+        <w:br w:type="page"/>
+      </w:r>
+    </w:p>
+    <w:p>
+      <w:pPr>
         <w:pStyle w:val="BodyA"/>
         <w:rPr>
           <w:rStyle w:val="None"/>
-          <w:rFonts w:ascii="Times New Roman" w:hAnsi="Times New Roman"/>
+          <w:rFonts w:ascii="Times New Roman" w:hAnsi="Times New Roman" w:cs="Times New Roman"/>
           <w:b/>
           <w:bCs/>
           <w:kern w:val="0"/>
@@ -2934,11 +3058,12 @@
       <w:r>
         <w:rPr>
           <w:rStyle w:val="None"/>
-          <w:rFonts w:ascii="Times New Roman" w:hAnsi="Times New Roman"/>
+          <w:rFonts w:ascii="Times New Roman" w:hAnsi="Times New Roman" w:cs="Times New Roman"/>
           <w:b/>
           <w:bCs/>
           <w:kern w:val="0"/>
         </w:rPr>
+        <w:lastRenderedPageBreak/>
         <w:t xml:space="preserve">Task 2-c </w:t>
       </w:r>
     </w:p>
@@ -2947,7 +3072,7 @@
         <w:pStyle w:val="BodyA"/>
         <w:rPr>
           <w:rStyle w:val="None"/>
-          <w:rFonts w:ascii="Times New Roman" w:hAnsi="Times New Roman"/>
+          <w:rFonts w:ascii="Times New Roman" w:hAnsi="Times New Roman" w:cs="Times New Roman"/>
           <w:b/>
           <w:bCs/>
           <w:kern w:val="0"/>
@@ -2968,17 +3093,11 @@
         <w:autoSpaceDN w:val="0"/>
         <w:adjustRightInd w:val="0"/>
         <w:rPr>
-          <w:rFonts w:ascii="AppleSystemUIFont" w:hAnsi="AppleSystemUIFont" w:cs="AppleSystemUIFont"/>
-          <w:sz w:val="26"/>
-          <w:szCs w:val="26"/>
           <w:lang w:val="en-GB" w:eastAsia="zh-CN"/>
         </w:rPr>
       </w:pPr>
       <w:r>
         <w:rPr>
-          <w:rFonts w:ascii="AppleSystemUIFont" w:hAnsi="AppleSystemUIFont" w:cs="AppleSystemUIFont"/>
-          <w:sz w:val="26"/>
-          <w:szCs w:val="26"/>
           <w:lang w:val="en-GB" w:eastAsia="zh-CN"/>
         </w:rPr>
         <w:t>Prompt Used for Prototypes:</w:t>
@@ -2998,9 +3117,6 @@
         <w:autoSpaceDN w:val="0"/>
         <w:adjustRightInd w:val="0"/>
         <w:rPr>
-          <w:rFonts w:ascii="AppleSystemUIFont" w:hAnsi="AppleSystemUIFont" w:cs="AppleSystemUIFont"/>
-          <w:sz w:val="26"/>
-          <w:szCs w:val="26"/>
           <w:lang w:val="en-GB" w:eastAsia="zh-CN"/>
         </w:rPr>
       </w:pPr>
@@ -3019,37 +3135,25 @@
         <w:autoSpaceDN w:val="0"/>
         <w:adjustRightInd w:val="0"/>
         <w:rPr>
-          <w:rFonts w:ascii="AppleSystemUIFont" w:hAnsi="AppleSystemUIFont" w:cs="AppleSystemUIFont"/>
-          <w:sz w:val="26"/>
-          <w:szCs w:val="26"/>
           <w:lang w:val="en-GB" w:eastAsia="zh-CN"/>
         </w:rPr>
       </w:pPr>
       <w:r>
         <w:rPr>
-          <w:rFonts w:ascii="AppleSystemUIFont" w:hAnsi="AppleSystemUIFont" w:cs="AppleSystemUIFont"/>
-          <w:sz w:val="26"/>
-          <w:szCs w:val="26"/>
           <w:lang w:val="en-GB" w:eastAsia="zh-CN"/>
         </w:rPr>
         <w:t>Design a simple prototype of a web-based communication platform specifically for university students collaborating on group assignments and projects</w:t>
       </w:r>
       <w:r>
         <w:rPr>
-          <w:rFonts w:ascii="AppleSystemUIFont" w:hAnsi="AppleSystemUIFont" w:cs="AppleSystemUIFont"/>
           <w:b/>
           <w:bCs/>
-          <w:sz w:val="26"/>
-          <w:szCs w:val="26"/>
           <w:lang w:val="en-GB" w:eastAsia="zh-CN"/>
         </w:rPr>
         <w:t>.</w:t>
       </w:r>
       <w:r>
         <w:rPr>
-          <w:rFonts w:ascii="AppleSystemUIFont" w:hAnsi="AppleSystemUIFont" w:cs="AppleSystemUIFont"/>
-          <w:sz w:val="26"/>
-          <w:szCs w:val="26"/>
           <w:lang w:val="en-GB" w:eastAsia="zh-CN"/>
         </w:rPr>
         <w:t xml:space="preserve"> The platform should focus on helping students organise their work, communicate efficiently, and keep track of shared responsibilities throughout the assignment lifecycle.</w:t>
@@ -3069,9 +3173,6 @@
         <w:autoSpaceDN w:val="0"/>
         <w:adjustRightInd w:val="0"/>
         <w:rPr>
-          <w:rFonts w:ascii="AppleSystemUIFont" w:hAnsi="AppleSystemUIFont" w:cs="AppleSystemUIFont"/>
-          <w:sz w:val="26"/>
-          <w:szCs w:val="26"/>
           <w:lang w:val="en-GB" w:eastAsia="zh-CN"/>
         </w:rPr>
       </w:pPr>
@@ -3090,17 +3191,11 @@
         <w:autoSpaceDN w:val="0"/>
         <w:adjustRightInd w:val="0"/>
         <w:rPr>
-          <w:rFonts w:ascii="AppleSystemUIFont" w:hAnsi="AppleSystemUIFont" w:cs="AppleSystemUIFont"/>
-          <w:sz w:val="26"/>
-          <w:szCs w:val="26"/>
           <w:lang w:val="en-GB" w:eastAsia="zh-CN"/>
         </w:rPr>
       </w:pPr>
       <w:r>
         <w:rPr>
-          <w:rFonts w:ascii="AppleSystemUIFont" w:hAnsi="AppleSystemUIFont" w:cs="AppleSystemUIFont"/>
-          <w:sz w:val="26"/>
-          <w:szCs w:val="26"/>
           <w:lang w:val="en-GB" w:eastAsia="zh-CN"/>
         </w:rPr>
         <w:t>The prototype should include the following key interface components:</w:t>
@@ -3125,17 +3220,11 @@
         <w:autoSpaceDN w:val="0"/>
         <w:adjustRightInd w:val="0"/>
         <w:rPr>
-          <w:rFonts w:ascii="AppleSystemUIFont" w:hAnsi="AppleSystemUIFont" w:cs="AppleSystemUIFont"/>
-          <w:sz w:val="26"/>
-          <w:szCs w:val="26"/>
           <w:lang w:val="en-GB" w:eastAsia="zh-CN"/>
         </w:rPr>
       </w:pPr>
       <w:r>
         <w:rPr>
-          <w:rFonts w:ascii="AppleSystemUIFont" w:hAnsi="AppleSystemUIFont" w:cs="AppleSystemUIFont"/>
-          <w:sz w:val="26"/>
-          <w:szCs w:val="26"/>
           <w:lang w:val="en-GB" w:eastAsia="zh-CN"/>
         </w:rPr>
         <w:t>Login Screen – simple authentication for students to access their groups</w:t>
@@ -3160,26 +3249,17 @@
         <w:autoSpaceDN w:val="0"/>
         <w:adjustRightInd w:val="0"/>
         <w:rPr>
-          <w:rFonts w:ascii="AppleSystemUIFont" w:hAnsi="AppleSystemUIFont" w:cs="AppleSystemUIFont"/>
-          <w:sz w:val="26"/>
-          <w:szCs w:val="26"/>
           <w:lang w:val="en-GB" w:eastAsia="zh-CN"/>
         </w:rPr>
       </w:pPr>
       <w:r>
         <w:rPr>
-          <w:rFonts w:ascii="AppleSystemUIFont" w:hAnsi="AppleSystemUIFont" w:cs="AppleSystemUIFont"/>
-          <w:sz w:val="26"/>
-          <w:szCs w:val="26"/>
           <w:lang w:val="en-GB" w:eastAsia="zh-CN"/>
         </w:rPr>
         <w:t>Group Dashboard – overview of group members, upcoming deadlines, recent activity, and quick access to group tools</w:t>
       </w:r>
       <w:r>
         <w:rPr>
-          <w:rFonts w:ascii="AppleSystemUIFont" w:hAnsi="AppleSystemUIFont" w:cs="AppleSystemUIFont"/>
-          <w:sz w:val="26"/>
-          <w:szCs w:val="26"/>
           <w:lang w:val="en-GB" w:eastAsia="zh-CN"/>
         </w:rPr>
         <w:t>.</w:t>
@@ -3204,26 +3284,17 @@
         <w:autoSpaceDN w:val="0"/>
         <w:adjustRightInd w:val="0"/>
         <w:rPr>
-          <w:rFonts w:ascii="AppleSystemUIFont" w:hAnsi="AppleSystemUIFont" w:cs="AppleSystemUIFont"/>
-          <w:sz w:val="26"/>
-          <w:szCs w:val="26"/>
           <w:lang w:val="en-GB" w:eastAsia="zh-CN"/>
         </w:rPr>
       </w:pPr>
       <w:r>
         <w:rPr>
-          <w:rFonts w:ascii="AppleSystemUIFont" w:hAnsi="AppleSystemUIFont" w:cs="AppleSystemUIFont"/>
-          <w:sz w:val="26"/>
-          <w:szCs w:val="26"/>
           <w:lang w:val="en-GB" w:eastAsia="zh-CN"/>
         </w:rPr>
         <w:t>Group Chat – real-time messaging for discussion and coordination</w:t>
       </w:r>
       <w:r>
         <w:rPr>
-          <w:rFonts w:ascii="AppleSystemUIFont" w:hAnsi="AppleSystemUIFont" w:cs="AppleSystemUIFont"/>
-          <w:sz w:val="26"/>
-          <w:szCs w:val="26"/>
           <w:lang w:val="en-GB" w:eastAsia="zh-CN"/>
         </w:rPr>
         <w:t>.</w:t>
@@ -3248,26 +3319,17 @@
         <w:autoSpaceDN w:val="0"/>
         <w:adjustRightInd w:val="0"/>
         <w:rPr>
-          <w:rFonts w:ascii="AppleSystemUIFont" w:hAnsi="AppleSystemUIFont" w:cs="AppleSystemUIFont"/>
-          <w:sz w:val="26"/>
-          <w:szCs w:val="26"/>
           <w:lang w:val="en-GB" w:eastAsia="zh-CN"/>
         </w:rPr>
       </w:pPr>
       <w:r>
         <w:rPr>
-          <w:rFonts w:ascii="AppleSystemUIFont" w:hAnsi="AppleSystemUIFont" w:cs="AppleSystemUIFont"/>
-          <w:sz w:val="26"/>
-          <w:szCs w:val="26"/>
           <w:lang w:val="en-GB" w:eastAsia="zh-CN"/>
         </w:rPr>
         <w:t>Task Management Board – a simple Kanban/Jira-style board where tasks can be created, assigned to members, and moved between stages (e.g., To Do, In Progress, Completed)</w:t>
       </w:r>
       <w:r>
         <w:rPr>
-          <w:rFonts w:ascii="AppleSystemUIFont" w:hAnsi="AppleSystemUIFont" w:cs="AppleSystemUIFont"/>
-          <w:sz w:val="26"/>
-          <w:szCs w:val="26"/>
           <w:lang w:val="en-GB" w:eastAsia="zh-CN"/>
         </w:rPr>
         <w:t>.</w:t>
@@ -3292,26 +3354,17 @@
         <w:autoSpaceDN w:val="0"/>
         <w:adjustRightInd w:val="0"/>
         <w:rPr>
-          <w:rFonts w:ascii="AppleSystemUIFont" w:hAnsi="AppleSystemUIFont" w:cs="AppleSystemUIFont"/>
-          <w:sz w:val="26"/>
-          <w:szCs w:val="26"/>
           <w:lang w:val="en-GB" w:eastAsia="zh-CN"/>
         </w:rPr>
       </w:pPr>
       <w:r>
         <w:rPr>
-          <w:rFonts w:ascii="AppleSystemUIFont" w:hAnsi="AppleSystemUIFont" w:cs="AppleSystemUIFont"/>
-          <w:sz w:val="26"/>
-          <w:szCs w:val="26"/>
           <w:lang w:val="en-GB" w:eastAsia="zh-CN"/>
         </w:rPr>
         <w:t>File Sharing Section – a space where group members can upload, download, and organise shared documents</w:t>
       </w:r>
       <w:r>
         <w:rPr>
-          <w:rFonts w:ascii="AppleSystemUIFont" w:hAnsi="AppleSystemUIFont" w:cs="AppleSystemUIFont"/>
-          <w:sz w:val="26"/>
-          <w:szCs w:val="26"/>
           <w:lang w:val="en-GB" w:eastAsia="zh-CN"/>
         </w:rPr>
         <w:t>.</w:t>
@@ -3336,26 +3389,17 @@
         <w:autoSpaceDN w:val="0"/>
         <w:adjustRightInd w:val="0"/>
         <w:rPr>
-          <w:rFonts w:ascii="AppleSystemUIFont" w:hAnsi="AppleSystemUIFont" w:cs="AppleSystemUIFont"/>
-          <w:sz w:val="26"/>
-          <w:szCs w:val="26"/>
           <w:lang w:val="en-GB" w:eastAsia="zh-CN"/>
         </w:rPr>
       </w:pPr>
       <w:r>
         <w:rPr>
-          <w:rFonts w:ascii="AppleSystemUIFont" w:hAnsi="AppleSystemUIFont" w:cs="AppleSystemUIFont"/>
-          <w:sz w:val="26"/>
-          <w:szCs w:val="26"/>
           <w:lang w:val="en-GB" w:eastAsia="zh-CN"/>
         </w:rPr>
         <w:t>AI Meeting Summary Feature (Unique Feature) – an integrated AI tool that automatically summarises meeting discussions or chat messages into key points, action items, and assigned tasks to help students keep track of decisions and responsibilities</w:t>
       </w:r>
       <w:r>
         <w:rPr>
-          <w:rFonts w:ascii="AppleSystemUIFont" w:hAnsi="AppleSystemUIFont" w:cs="AppleSystemUIFont"/>
-          <w:sz w:val="26"/>
-          <w:szCs w:val="26"/>
           <w:lang w:val="en-GB" w:eastAsia="zh-CN"/>
         </w:rPr>
         <w:t>.</w:t>
@@ -3376,9 +3420,6 @@
         <w:autoSpaceDN w:val="0"/>
         <w:adjustRightInd w:val="0"/>
         <w:rPr>
-          <w:rFonts w:ascii="AppleSystemUIFont" w:hAnsi="AppleSystemUIFont" w:cs="AppleSystemUIFont"/>
-          <w:sz w:val="26"/>
-          <w:szCs w:val="26"/>
           <w:lang w:val="en-GB" w:eastAsia="zh-CN"/>
         </w:rPr>
       </w:pPr>
@@ -3396,49 +3437,39 @@
       </w:pPr>
       <w:r>
         <w:rPr>
-          <w:rFonts w:ascii="AppleSystemUIFont" w:hAnsi="AppleSystemUIFont" w:cs="AppleSystemUIFont"/>
-          <w:sz w:val="26"/>
-          <w:szCs w:val="26"/>
+          <w:rFonts w:ascii="Times New Roman" w:hAnsi="Times New Roman" w:cs="Times New Roman"/>
           <w:lang w:val="en-GB"/>
         </w:rPr>
         <w:t>The design should be clean, minimal, and intuitive</w:t>
       </w:r>
       <w:r>
         <w:rPr>
-          <w:rFonts w:ascii="AppleSystemUIFont" w:hAnsi="AppleSystemUIFont" w:cs="AppleSystemUIFont"/>
+          <w:rFonts w:ascii="Times New Roman" w:hAnsi="Times New Roman" w:cs="Times New Roman"/>
           <w:b/>
           <w:bCs/>
-          <w:sz w:val="26"/>
-          <w:szCs w:val="26"/>
           <w:lang w:val="en-GB"/>
         </w:rPr>
         <w:t>,</w:t>
       </w:r>
       <w:r>
         <w:rPr>
-          <w:rFonts w:ascii="AppleSystemUIFont" w:hAnsi="AppleSystemUIFont" w:cs="AppleSystemUIFont"/>
-          <w:sz w:val="26"/>
-          <w:szCs w:val="26"/>
+          <w:rFonts w:ascii="Times New Roman" w:hAnsi="Times New Roman" w:cs="Times New Roman"/>
           <w:lang w:val="en-GB"/>
         </w:rPr>
         <w:t xml:space="preserve"> suitable for quick usability testing and</w:t>
       </w:r>
       <w:r>
         <w:rPr>
-          <w:rFonts w:ascii="AppleSystemUIFont" w:hAnsi="AppleSystemUIFont" w:cs="AppleSystemUIFont"/>
+          <w:rFonts w:ascii="Times New Roman" w:hAnsi="Times New Roman" w:cs="Times New Roman"/>
           <w:b/>
           <w:bCs/>
-          <w:sz w:val="26"/>
-          <w:szCs w:val="26"/>
           <w:lang w:val="en-GB"/>
         </w:rPr>
         <w:t xml:space="preserve"> </w:t>
       </w:r>
       <w:r>
         <w:rPr>
-          <w:rFonts w:ascii="AppleSystemUIFont" w:hAnsi="AppleSystemUIFont" w:cs="AppleSystemUIFont"/>
-          <w:sz w:val="26"/>
-          <w:szCs w:val="26"/>
+          <w:rFonts w:ascii="Times New Roman" w:hAnsi="Times New Roman" w:cs="Times New Roman"/>
           <w:lang w:val="en-GB"/>
         </w:rPr>
         <w:t>early-stage prototyping. Focus on simple layouts, clear navigation, and essential functionality rather than visual polish.</w:t>
@@ -3487,7 +3518,6 @@
           <w:bCs/>
           <w:kern w:val="0"/>
         </w:rPr>
-        <w:lastRenderedPageBreak/>
         <w:t>Task 2-d (Please use the table below to answer)</w:t>
       </w:r>
     </w:p>
@@ -4206,7 +4236,11 @@
               <w:right w:w="80" w:type="dxa"/>
             </w:tcMar>
           </w:tcPr>
-          <w:p/>
+          <w:p>
+            <w:r>
+              <w:t>Claude.ai</w:t>
+            </w:r>
+          </w:p>
         </w:tc>
         <w:tc>
           <w:tcPr>
@@ -4224,7 +4258,124 @@
               <w:right w:w="80" w:type="dxa"/>
             </w:tcMar>
           </w:tcPr>
-          <w:p/>
+          <w:p>
+            <w:r>
+              <w:rPr>
+                <w:noProof/>
+              </w:rPr>
+              <w:drawing>
+                <wp:inline distT="0" distB="0" distL="0" distR="0" wp14:anchorId="607F6D96" wp14:editId="0793BA09">
+                  <wp:extent cx="4488815" cy="2117090"/>
+                  <wp:effectExtent l="0" t="0" r="0" b="3810"/>
+                  <wp:docPr id="1395124497" name="Picture 1"/>
+                  <wp:cNvGraphicFramePr>
+                    <a:graphicFrameLocks xmlns:a="http://schemas.openxmlformats.org/drawingml/2006/main" noChangeAspect="1"/>
+                  </wp:cNvGraphicFramePr>
+                  <a:graphic xmlns:a="http://schemas.openxmlformats.org/drawingml/2006/main">
+                    <a:graphicData uri="http://schemas.openxmlformats.org/drawingml/2006/picture">
+                      <pic:pic xmlns:pic="http://schemas.openxmlformats.org/drawingml/2006/picture">
+                        <pic:nvPicPr>
+                          <pic:cNvPr id="1395124497" name="Picture 1395124497"/>
+                          <pic:cNvPicPr/>
+                        </pic:nvPicPr>
+                        <pic:blipFill>
+                          <a:blip r:embed="rId17" cstate="print">
+                            <a:extLst>
+                              <a:ext uri="{28A0092B-C50C-407E-A947-70E740481C1C}">
+                                <a14:useLocalDpi xmlns:a14="http://schemas.microsoft.com/office/drawing/2010/main" val="0"/>
+                              </a:ext>
+                            </a:extLst>
+                          </a:blip>
+                          <a:stretch>
+                            <a:fillRect/>
+                          </a:stretch>
+                        </pic:blipFill>
+                        <pic:spPr>
+                          <a:xfrm>
+                            <a:off x="0" y="0"/>
+                            <a:ext cx="4488815" cy="2117090"/>
+                          </a:xfrm>
+                          <a:prstGeom prst="rect">
+                            <a:avLst/>
+                          </a:prstGeom>
+                        </pic:spPr>
+                      </pic:pic>
+                    </a:graphicData>
+                  </a:graphic>
+                </wp:inline>
+              </w:drawing>
+            </w:r>
+          </w:p>
+          <w:p>
+            <w:r>
+              <w:t xml:space="preserve">The dashboard includes all features mentioned in the prompt. Easy readability and clear signposting of all features. Project progress and upcoming deadlines are all </w:t>
+            </w:r>
+            <w:proofErr w:type="gramStart"/>
+            <w:r>
+              <w:t>visible on first glance, providing</w:t>
+            </w:r>
+            <w:proofErr w:type="gramEnd"/>
+            <w:r>
+              <w:t xml:space="preserve"> simple trackability. </w:t>
+            </w:r>
+          </w:p>
+          <w:p>
+            <w:r>
+              <w:rPr>
+                <w:noProof/>
+              </w:rPr>
+              <w:lastRenderedPageBreak/>
+              <w:drawing>
+                <wp:inline distT="0" distB="0" distL="0" distR="0" wp14:anchorId="2DF1B320" wp14:editId="6A98EB9C">
+                  <wp:extent cx="4488815" cy="2012315"/>
+                  <wp:effectExtent l="0" t="0" r="0" b="0"/>
+                  <wp:docPr id="330982340" name="Picture 2"/>
+                  <wp:cNvGraphicFramePr>
+                    <a:graphicFrameLocks xmlns:a="http://schemas.openxmlformats.org/drawingml/2006/main" noChangeAspect="1"/>
+                  </wp:cNvGraphicFramePr>
+                  <a:graphic xmlns:a="http://schemas.openxmlformats.org/drawingml/2006/main">
+                    <a:graphicData uri="http://schemas.openxmlformats.org/drawingml/2006/picture">
+                      <pic:pic xmlns:pic="http://schemas.openxmlformats.org/drawingml/2006/picture">
+                        <pic:nvPicPr>
+                          <pic:cNvPr id="330982340" name="Picture 330982340"/>
+                          <pic:cNvPicPr/>
+                        </pic:nvPicPr>
+                        <pic:blipFill>
+                          <a:blip r:embed="rId18" cstate="print">
+                            <a:extLst>
+                              <a:ext uri="{28A0092B-C50C-407E-A947-70E740481C1C}">
+                                <a14:useLocalDpi xmlns:a14="http://schemas.microsoft.com/office/drawing/2010/main" val="0"/>
+                              </a:ext>
+                            </a:extLst>
+                          </a:blip>
+                          <a:stretch>
+                            <a:fillRect/>
+                          </a:stretch>
+                        </pic:blipFill>
+                        <pic:spPr>
+                          <a:xfrm>
+                            <a:off x="0" y="0"/>
+                            <a:ext cx="4488815" cy="2012315"/>
+                          </a:xfrm>
+                          <a:prstGeom prst="rect">
+                            <a:avLst/>
+                          </a:prstGeom>
+                        </pic:spPr>
+                      </pic:pic>
+                    </a:graphicData>
+                  </a:graphic>
+                </wp:inline>
+              </w:drawing>
+            </w:r>
+          </w:p>
+          <w:p>
+            <w:r>
+              <w:t xml:space="preserve">Each task has a brief description, due date and team member allocated to complete it. This allows easy trackability of progress and ensures </w:t>
+            </w:r>
+            <w:r>
+              <w:t xml:space="preserve">all members are aware of their allocated tasks and when they must be completed by. </w:t>
+            </w:r>
+          </w:p>
         </w:tc>
       </w:tr>
       <w:tr>
@@ -4247,7 +4398,12 @@
               <w:right w:w="80" w:type="dxa"/>
             </w:tcMar>
           </w:tcPr>
-          <w:p/>
+          <w:p>
+            <w:r>
+              <w:lastRenderedPageBreak/>
+              <w:t>ChatGPT</w:t>
+            </w:r>
+          </w:p>
         </w:tc>
         <w:tc>
           <w:tcPr>
@@ -4265,7 +4421,113 @@
               <w:right w:w="80" w:type="dxa"/>
             </w:tcMar>
           </w:tcPr>
-          <w:p/>
+          <w:p>
+            <w:r>
+              <w:rPr>
+                <w:noProof/>
+              </w:rPr>
+              <w:drawing>
+                <wp:inline distT="0" distB="0" distL="0" distR="0" wp14:anchorId="01656823" wp14:editId="7C552C7E">
+                  <wp:extent cx="4488815" cy="2978785"/>
+                  <wp:effectExtent l="0" t="0" r="0" b="5715"/>
+                  <wp:docPr id="1523322266" name="Picture 3"/>
+                  <wp:cNvGraphicFramePr>
+                    <a:graphicFrameLocks xmlns:a="http://schemas.openxmlformats.org/drawingml/2006/main" noChangeAspect="1"/>
+                  </wp:cNvGraphicFramePr>
+                  <a:graphic xmlns:a="http://schemas.openxmlformats.org/drawingml/2006/main">
+                    <a:graphicData uri="http://schemas.openxmlformats.org/drawingml/2006/picture">
+                      <pic:pic xmlns:pic="http://schemas.openxmlformats.org/drawingml/2006/picture">
+                        <pic:nvPicPr>
+                          <pic:cNvPr id="1523322266" name="Picture 1523322266"/>
+                          <pic:cNvPicPr/>
+                        </pic:nvPicPr>
+                        <pic:blipFill>
+                          <a:blip r:embed="rId19" cstate="print">
+                            <a:extLst>
+                              <a:ext uri="{28A0092B-C50C-407E-A947-70E740481C1C}">
+                                <a14:useLocalDpi xmlns:a14="http://schemas.microsoft.com/office/drawing/2010/main" val="0"/>
+                              </a:ext>
+                            </a:extLst>
+                          </a:blip>
+                          <a:stretch>
+                            <a:fillRect/>
+                          </a:stretch>
+                        </pic:blipFill>
+                        <pic:spPr>
+                          <a:xfrm>
+                            <a:off x="0" y="0"/>
+                            <a:ext cx="4488815" cy="2978785"/>
+                          </a:xfrm>
+                          <a:prstGeom prst="rect">
+                            <a:avLst/>
+                          </a:prstGeom>
+                        </pic:spPr>
+                      </pic:pic>
+                    </a:graphicData>
+                  </a:graphic>
+                </wp:inline>
+              </w:drawing>
+            </w:r>
+          </w:p>
+          <w:p>
+            <w:r>
+              <w:t xml:space="preserve">Minimalistic dashboard (after log-in screen) that provides an overview of all features in the tab on the left for easy navigation. </w:t>
+            </w:r>
+          </w:p>
+          <w:p>
+            <w:r>
+              <w:rPr>
+                <w:noProof/>
+              </w:rPr>
+              <w:lastRenderedPageBreak/>
+              <w:drawing>
+                <wp:inline distT="0" distB="0" distL="0" distR="0" wp14:anchorId="5D440841" wp14:editId="7CBD117F">
+                  <wp:extent cx="4488815" cy="2905760"/>
+                  <wp:effectExtent l="0" t="0" r="0" b="2540"/>
+                  <wp:docPr id="546066919" name="Picture 4"/>
+                  <wp:cNvGraphicFramePr>
+                    <a:graphicFrameLocks xmlns:a="http://schemas.openxmlformats.org/drawingml/2006/main" noChangeAspect="1"/>
+                  </wp:cNvGraphicFramePr>
+                  <a:graphic xmlns:a="http://schemas.openxmlformats.org/drawingml/2006/main">
+                    <a:graphicData uri="http://schemas.openxmlformats.org/drawingml/2006/picture">
+                      <pic:pic xmlns:pic="http://schemas.openxmlformats.org/drawingml/2006/picture">
+                        <pic:nvPicPr>
+                          <pic:cNvPr id="546066919" name="Picture 546066919"/>
+                          <pic:cNvPicPr/>
+                        </pic:nvPicPr>
+                        <pic:blipFill>
+                          <a:blip r:embed="rId20" cstate="print">
+                            <a:extLst>
+                              <a:ext uri="{28A0092B-C50C-407E-A947-70E740481C1C}">
+                                <a14:useLocalDpi xmlns:a14="http://schemas.microsoft.com/office/drawing/2010/main" val="0"/>
+                              </a:ext>
+                            </a:extLst>
+                          </a:blip>
+                          <a:stretch>
+                            <a:fillRect/>
+                          </a:stretch>
+                        </pic:blipFill>
+                        <pic:spPr>
+                          <a:xfrm>
+                            <a:off x="0" y="0"/>
+                            <a:ext cx="4488815" cy="2905760"/>
+                          </a:xfrm>
+                          <a:prstGeom prst="rect">
+                            <a:avLst/>
+                          </a:prstGeom>
+                        </pic:spPr>
+                      </pic:pic>
+                    </a:graphicData>
+                  </a:graphic>
+                </wp:inline>
+              </w:drawing>
+            </w:r>
+          </w:p>
+          <w:p>
+            <w:r>
+              <w:t xml:space="preserve">Includes all tasks to be completed, sorted by progress. It includes the team member assigned to the task as well as the due day of week (not date). </w:t>
+            </w:r>
+          </w:p>
         </w:tc>
       </w:tr>
       <w:tr>
@@ -4790,7 +5052,11 @@
               <w:right w:w="80" w:type="dxa"/>
             </w:tcMar>
           </w:tcPr>
-          <w:p/>
+          <w:p>
+            <w:r>
+              <w:t>Claude.ai</w:t>
+            </w:r>
+          </w:p>
         </w:tc>
         <w:tc>
           <w:tcPr>
@@ -4808,7 +5074,11 @@
               <w:right w:w="80" w:type="dxa"/>
             </w:tcMar>
           </w:tcPr>
-          <w:p/>
+          <w:p>
+            <w:r>
+              <w:t>9/10</w:t>
+            </w:r>
+          </w:p>
         </w:tc>
         <w:tc>
           <w:tcPr>
@@ -4826,7 +5096,35 @@
               <w:right w:w="80" w:type="dxa"/>
             </w:tcMar>
           </w:tcPr>
-          <w:p/>
+          <w:p>
+            <w:r>
+              <w:t xml:space="preserve">The design is easy to follow and clean but </w:t>
+            </w:r>
+            <w:proofErr w:type="spellStart"/>
+            <w:r>
+              <w:t>colourful</w:t>
+            </w:r>
+            <w:proofErr w:type="spellEnd"/>
+            <w:r>
+              <w:t xml:space="preserve"> which aids in guiding users to more important aspects of the dashboard. The task board interface is well structured, with the priority of tasks </w:t>
+            </w:r>
+            <w:proofErr w:type="gramStart"/>
+            <w:r>
+              <w:t>an</w:t>
+            </w:r>
+            <w:proofErr w:type="gramEnd"/>
+            <w:r>
+              <w:t xml:space="preserve"> useful feature for users. If the interface included a countdown to the due date, it would aid users in more effective </w:t>
+            </w:r>
+            <w:proofErr w:type="spellStart"/>
+            <w:r>
+              <w:t>organisation</w:t>
+            </w:r>
+            <w:proofErr w:type="spellEnd"/>
+            <w:r>
+              <w:t xml:space="preserve">. </w:t>
+            </w:r>
+          </w:p>
         </w:tc>
       </w:tr>
       <w:tr>
@@ -4849,7 +5147,11 @@
               <w:right w:w="80" w:type="dxa"/>
             </w:tcMar>
           </w:tcPr>
-          <w:p/>
+          <w:p>
+            <w:r>
+              <w:t>ChatGPT</w:t>
+            </w:r>
+          </w:p>
         </w:tc>
         <w:tc>
           <w:tcPr>
@@ -4867,7 +5169,11 @@
               <w:right w:w="80" w:type="dxa"/>
             </w:tcMar>
           </w:tcPr>
-          <w:p/>
+          <w:p>
+            <w:r>
+              <w:t>5/10</w:t>
+            </w:r>
+          </w:p>
         </w:tc>
         <w:tc>
           <w:tcPr>
@@ -4885,7 +5191,23 @@
               <w:right w:w="80" w:type="dxa"/>
             </w:tcMar>
           </w:tcPr>
-          <w:p/>
+          <w:p>
+            <w:r>
+              <w:t xml:space="preserve">The design is considered boring due to its lack of </w:t>
+            </w:r>
+            <w:proofErr w:type="spellStart"/>
+            <w:r>
+              <w:t>colour</w:t>
+            </w:r>
+            <w:proofErr w:type="spellEnd"/>
+            <w:r>
+              <w:t xml:space="preserve"> and icons. Additionally, the task management screen is not very effective. Each task does not have a short description entailing what that </w:t>
+            </w:r>
+            <w:r>
+              <w:lastRenderedPageBreak/>
+              <w:t xml:space="preserve">specific task encompasses. The lack of specific due dates is not a desirable feature. </w:t>
+            </w:r>
+          </w:p>
         </w:tc>
       </w:tr>
       <w:tr>
@@ -5405,7 +5727,11 @@
               <w:right w:w="80" w:type="dxa"/>
             </w:tcMar>
           </w:tcPr>
-          <w:p/>
+          <w:p>
+            <w:r>
+              <w:t>Christina Liu</w:t>
+            </w:r>
+          </w:p>
         </w:tc>
         <w:tc>
           <w:tcPr>
@@ -5423,7 +5749,11 @@
               <w:right w:w="80" w:type="dxa"/>
             </w:tcMar>
           </w:tcPr>
-          <w:p/>
+          <w:p>
+            <w:r>
+              <w:t xml:space="preserve">Created Instagram group chat for communication between team members. </w:t>
+            </w:r>
+          </w:p>
         </w:tc>
       </w:tr>
       <w:tr>
@@ -5787,7 +6117,11 @@
               <w:right w:w="80" w:type="dxa"/>
             </w:tcMar>
           </w:tcPr>
-          <w:p/>
+          <w:p>
+            <w:r>
+              <w:t>Christina Liu</w:t>
+            </w:r>
+          </w:p>
         </w:tc>
         <w:tc>
           <w:tcPr>
@@ -5805,7 +6139,11 @@
               <w:right w:w="80" w:type="dxa"/>
             </w:tcMar>
           </w:tcPr>
-          <w:p/>
+          <w:p>
+            <w:r>
+              <w:t xml:space="preserve">Researched commonly used AI platforms for generating code. </w:t>
+            </w:r>
+          </w:p>
         </w:tc>
       </w:tr>
       <w:tr>
@@ -6149,7 +6487,11 @@
               <w:right w:w="80" w:type="dxa"/>
             </w:tcMar>
           </w:tcPr>
-          <w:p/>
+          <w:p>
+            <w:r>
+              <w:t xml:space="preserve">Christina Liu </w:t>
+            </w:r>
+          </w:p>
         </w:tc>
         <w:tc>
           <w:tcPr>
@@ -6167,7 +6509,11 @@
               <w:right w:w="80" w:type="dxa"/>
             </w:tcMar>
           </w:tcPr>
-          <w:p/>
+          <w:p>
+            <w:r>
+              <w:t xml:space="preserve">Completed all parts of question 2 for two platforms (Claude.ai and ChatGPT). </w:t>
+            </w:r>
+          </w:p>
         </w:tc>
       </w:tr>
       <w:tr>
@@ -6426,8 +6772,8 @@
       </w:pPr>
     </w:p>
     <w:sectPr>
-      <w:headerReference w:type="default" r:id="rId17"/>
-      <w:footerReference w:type="default" r:id="rId18"/>
+      <w:headerReference w:type="default" r:id="rId21"/>
+      <w:footerReference w:type="default" r:id="rId22"/>
       <w:pgSz w:w="11900" w:h="16840"/>
       <w:pgMar w:top="1440" w:right="1440" w:bottom="1440" w:left="1440" w:header="708" w:footer="708" w:gutter="0"/>
       <w:cols w:space="720"/>

</xml_diff>

<commit_message>
added URLs to chatgpt and claude in 2d
</commit_message>
<xml_diff>
--- a/INFO2222-ProjectTemplate-P1.docx
+++ b/INFO2222-ProjectTemplate-P1.docx
@@ -4376,6 +4376,27 @@
               <w:t xml:space="preserve">all members are aware of their allocated tasks and when they must be completed by. </w:t>
             </w:r>
           </w:p>
+          <w:p/>
+          <w:p>
+            <w:r>
+              <w:t xml:space="preserve">Link to code: </w:t>
+            </w:r>
+            <w:hyperlink r:id="rId19" w:history="1">
+              <w:r>
+                <w:rPr>
+                  <w:rStyle w:val="Hyperlink"/>
+                  <w:color w:val="4472C4" w:themeColor="accent1"/>
+                </w:rPr>
+                <w:t>https://github.sydney.edu.au/INFO2222-2026-S1/PRJ-T02-G04/tree/31dfde7bc09f0b72c7b803f83945100f8ebab4b7/prototypes/Claude</w:t>
+              </w:r>
+            </w:hyperlink>
+            <w:r>
+              <w:rPr>
+                <w:color w:val="4472C4" w:themeColor="accent1"/>
+              </w:rPr>
+              <w:t xml:space="preserve"> </w:t>
+            </w:r>
+          </w:p>
         </w:tc>
       </w:tr>
       <w:tr>
@@ -4442,7 +4463,7 @@
                           <pic:cNvPicPr/>
                         </pic:nvPicPr>
                         <pic:blipFill>
-                          <a:blip r:embed="rId19" cstate="print">
+                          <a:blip r:embed="rId20" cstate="print">
                             <a:extLst>
                               <a:ext uri="{28A0092B-C50C-407E-A947-70E740481C1C}">
                                 <a14:useLocalDpi xmlns:a14="http://schemas.microsoft.com/office/drawing/2010/main" val="0"/>
@@ -4496,7 +4517,7 @@
                           <pic:cNvPicPr/>
                         </pic:nvPicPr>
                         <pic:blipFill>
-                          <a:blip r:embed="rId20" cstate="print">
+                          <a:blip r:embed="rId21" cstate="print">
                             <a:extLst>
                               <a:ext uri="{28A0092B-C50C-407E-A947-70E740481C1C}">
                                 <a14:useLocalDpi xmlns:a14="http://schemas.microsoft.com/office/drawing/2010/main" val="0"/>
@@ -4526,6 +4547,27 @@
           <w:p>
             <w:r>
               <w:t xml:space="preserve">Includes all tasks to be completed, sorted by progress. It includes the team member assigned to the task as well as the due day of week (not date). </w:t>
+            </w:r>
+          </w:p>
+          <w:p/>
+          <w:p>
+            <w:r>
+              <w:t xml:space="preserve">Link to code: </w:t>
+            </w:r>
+            <w:hyperlink r:id="rId22" w:history="1">
+              <w:r>
+                <w:rPr>
+                  <w:rStyle w:val="Hyperlink"/>
+                  <w:color w:val="4472C4" w:themeColor="accent1"/>
+                </w:rPr>
+                <w:t>https://github.sydney.edu.au/INFO2222-2026-S1/PRJ-T02-G04/tree/31dfde7bc09f0b72c7b803f83945100f8ebab4b7/prototypes/ChatGPT</w:t>
+              </w:r>
+            </w:hyperlink>
+            <w:r>
+              <w:rPr>
+                <w:color w:val="4472C4" w:themeColor="accent1"/>
+              </w:rPr>
+              <w:t xml:space="preserve"> </w:t>
             </w:r>
           </w:p>
         </w:tc>
@@ -5149,6 +5191,7 @@
           </w:tcPr>
           <w:p>
             <w:r>
+              <w:lastRenderedPageBreak/>
               <w:t>ChatGPT</w:t>
             </w:r>
           </w:p>
@@ -5201,11 +5244,7 @@
             </w:r>
             <w:proofErr w:type="spellEnd"/>
             <w:r>
-              <w:t xml:space="preserve"> and icons. Additionally, the task management screen is not very effective. Each task does not have a short description entailing what that </w:t>
-            </w:r>
-            <w:r>
-              <w:lastRenderedPageBreak/>
-              <w:t xml:space="preserve">specific task encompasses. The lack of specific due dates is not a desirable feature. </w:t>
+              <w:t xml:space="preserve"> and icons. Additionally, the task management screen is not very effective. Each task does not have a short description entailing what that specific task encompasses. The lack of specific due dates is not a desirable feature. </w:t>
             </w:r>
           </w:p>
         </w:tc>
@@ -6772,8 +6811,8 @@
       </w:pPr>
     </w:p>
     <w:sectPr>
-      <w:headerReference w:type="default" r:id="rId21"/>
-      <w:footerReference w:type="default" r:id="rId22"/>
+      <w:headerReference w:type="default" r:id="rId23"/>
+      <w:footerReference w:type="default" r:id="rId24"/>
       <w:pgSz w:w="11900" w:h="16840"/>
       <w:pgMar w:top="1440" w:right="1440" w:bottom="1440" w:left="1440" w:header="708" w:footer="708" w:gutter="0"/>
       <w:cols w:space="720"/>
@@ -8431,6 +8470,18 @@
       <w:ind w:left="720"/>
       <w:contextualSpacing/>
     </w:pPr>
+  </w:style>
+  <w:style w:type="character" w:styleId="UnresolvedMention">
+    <w:name w:val="Unresolved Mention"/>
+    <w:basedOn w:val="DefaultParagraphFont"/>
+    <w:uiPriority w:val="99"/>
+    <w:semiHidden/>
+    <w:unhideWhenUsed/>
+    <w:rsid w:val="006B149F"/>
+    <w:rPr>
+      <w:color w:val="605E5C"/>
+      <w:shd w:val="clear" w:color="auto" w:fill="E1DFDD"/>
+    </w:rPr>
   </w:style>
 </w:styles>
 </file>

</xml_diff>

<commit_message>
changed the promt 2c
</commit_message>
<xml_diff>
--- a/INFO2222-ProjectTemplate-P1.docx
+++ b/INFO2222-ProjectTemplate-P1.docx
@@ -3123,304 +3123,216 @@
     </w:p>
     <w:p>
       <w:pPr>
-        <w:pBdr>
-          <w:top w:val="none" w:sz="0" w:space="0" w:color="auto"/>
-          <w:left w:val="none" w:sz="0" w:space="0" w:color="auto"/>
-          <w:bottom w:val="none" w:sz="0" w:space="0" w:color="auto"/>
-          <w:right w:val="none" w:sz="0" w:space="0" w:color="auto"/>
-          <w:between w:val="none" w:sz="0" w:space="0" w:color="auto"/>
-          <w:bar w:val="none" w:sz="0" w:color="auto"/>
-        </w:pBdr>
-        <w:autoSpaceDE w:val="0"/>
-        <w:autoSpaceDN w:val="0"/>
-        <w:adjustRightInd w:val="0"/>
-        <w:rPr>
-          <w:lang w:val="en-GB" w:eastAsia="zh-CN"/>
+        <w:pStyle w:val="BodyA"/>
+        <w:rPr>
+          <w:rFonts w:ascii="Arial" w:hAnsi="Arial" w:cs="Arial"/>
+          <w:color w:val="0C1014"/>
+          <w:sz w:val="23"/>
+          <w:szCs w:val="23"/>
         </w:rPr>
       </w:pPr>
       <w:r>
         <w:rPr>
-          <w:lang w:val="en-GB" w:eastAsia="zh-CN"/>
-        </w:rPr>
-        <w:t>Design a simple prototype of a web-based communication platform specifically for university students collaborating on group assignments and projects</w:t>
-      </w:r>
-      <w:r>
-        <w:rPr>
-          <w:b/>
-          <w:bCs/>
-          <w:lang w:val="en-GB" w:eastAsia="zh-CN"/>
-        </w:rPr>
-        <w:t>.</w:t>
-      </w:r>
-      <w:r>
-        <w:rPr>
-          <w:lang w:val="en-GB" w:eastAsia="zh-CN"/>
-        </w:rPr>
-        <w:t xml:space="preserve"> The platform should focus on helping students organise their work, communicate efficiently, and keep track of shared responsibilities throughout the assignment lifecycle.</w:t>
+          <w:rFonts w:ascii="Arial" w:hAnsi="Arial" w:cs="Arial"/>
+          <w:color w:val="0C1014"/>
+          <w:sz w:val="23"/>
+          <w:szCs w:val="23"/>
+        </w:rPr>
+        <w:t>Design a simple web-based communication platform for university students doing group assignments.</w:t>
       </w:r>
     </w:p>
     <w:p>
       <w:pPr>
-        <w:pBdr>
-          <w:top w:val="none" w:sz="0" w:space="0" w:color="auto"/>
-          <w:left w:val="none" w:sz="0" w:space="0" w:color="auto"/>
-          <w:bottom w:val="none" w:sz="0" w:space="0" w:color="auto"/>
-          <w:right w:val="none" w:sz="0" w:space="0" w:color="auto"/>
-          <w:between w:val="none" w:sz="0" w:space="0" w:color="auto"/>
-          <w:bar w:val="none" w:sz="0" w:color="auto"/>
-        </w:pBdr>
-        <w:autoSpaceDE w:val="0"/>
-        <w:autoSpaceDN w:val="0"/>
-        <w:adjustRightInd w:val="0"/>
-        <w:rPr>
-          <w:lang w:val="en-GB" w:eastAsia="zh-CN"/>
+        <w:pStyle w:val="BodyA"/>
+        <w:rPr>
+          <w:rFonts w:ascii="Arial" w:hAnsi="Arial" w:cs="Arial"/>
+          <w:color w:val="0C1014"/>
+          <w:sz w:val="23"/>
+          <w:szCs w:val="23"/>
         </w:rPr>
       </w:pPr>
     </w:p>
     <w:p>
       <w:pPr>
-        <w:pBdr>
-          <w:top w:val="none" w:sz="0" w:space="0" w:color="auto"/>
-          <w:left w:val="none" w:sz="0" w:space="0" w:color="auto"/>
-          <w:bottom w:val="none" w:sz="0" w:space="0" w:color="auto"/>
-          <w:right w:val="none" w:sz="0" w:space="0" w:color="auto"/>
-          <w:between w:val="none" w:sz="0" w:space="0" w:color="auto"/>
-          <w:bar w:val="none" w:sz="0" w:color="auto"/>
-        </w:pBdr>
-        <w:autoSpaceDE w:val="0"/>
-        <w:autoSpaceDN w:val="0"/>
-        <w:adjustRightInd w:val="0"/>
-        <w:rPr>
-          <w:lang w:val="en-GB" w:eastAsia="zh-CN"/>
+        <w:pStyle w:val="BodyA"/>
+        <w:rPr>
+          <w:rFonts w:ascii="Arial" w:hAnsi="Arial" w:cs="Arial"/>
+          <w:color w:val="0C1014"/>
+          <w:sz w:val="23"/>
+          <w:szCs w:val="23"/>
         </w:rPr>
       </w:pPr>
       <w:r>
         <w:rPr>
-          <w:lang w:val="en-GB" w:eastAsia="zh-CN"/>
-        </w:rPr>
-        <w:t>The prototype should include the following key interface components:</w:t>
+          <w:rFonts w:ascii="Arial" w:hAnsi="Arial" w:cs="Arial"/>
+          <w:color w:val="0C1014"/>
+          <w:sz w:val="23"/>
+          <w:szCs w:val="23"/>
+        </w:rPr>
+        <w:t xml:space="preserve">The interface should include: </w:t>
       </w:r>
     </w:p>
     <w:p>
       <w:pPr>
-        <w:pStyle w:val="ListParagraph"/>
+        <w:pStyle w:val="BodyA"/>
         <w:numPr>
           <w:ilvl w:val="0"/>
-          <w:numId w:val="4"/>
+          <w:numId w:val="3"/>
         </w:numPr>
-        <w:pBdr>
-          <w:top w:val="none" w:sz="0" w:space="0" w:color="auto"/>
-          <w:left w:val="none" w:sz="0" w:space="0" w:color="auto"/>
-          <w:bottom w:val="none" w:sz="0" w:space="0" w:color="auto"/>
-          <w:right w:val="none" w:sz="0" w:space="0" w:color="auto"/>
-          <w:between w:val="none" w:sz="0" w:space="0" w:color="auto"/>
-          <w:bar w:val="none" w:sz="0" w:color="auto"/>
-        </w:pBdr>
-        <w:autoSpaceDE w:val="0"/>
-        <w:autoSpaceDN w:val="0"/>
-        <w:adjustRightInd w:val="0"/>
-        <w:rPr>
-          <w:lang w:val="en-GB" w:eastAsia="zh-CN"/>
+        <w:rPr>
+          <w:rFonts w:ascii="Times New Roman" w:eastAsia="Times New Roman" w:hAnsi="Times New Roman" w:cs="Times New Roman"/>
+          <w:b/>
+          <w:bCs/>
+          <w:kern w:val="0"/>
         </w:rPr>
       </w:pPr>
       <w:r>
         <w:rPr>
-          <w:lang w:val="en-GB" w:eastAsia="zh-CN"/>
-        </w:rPr>
-        <w:t>Login Screen – simple authentication for students to access their groups</w:t>
+          <w:rFonts w:ascii="Arial" w:hAnsi="Arial" w:cs="Arial"/>
+          <w:color w:val="0C1014"/>
+          <w:sz w:val="23"/>
+          <w:szCs w:val="23"/>
+        </w:rPr>
+        <w:t xml:space="preserve">login screen </w:t>
       </w:r>
     </w:p>
     <w:p>
       <w:pPr>
-        <w:pStyle w:val="ListParagraph"/>
+        <w:pStyle w:val="BodyA"/>
         <w:numPr>
           <w:ilvl w:val="0"/>
-          <w:numId w:val="4"/>
+          <w:numId w:val="3"/>
         </w:numPr>
-        <w:pBdr>
-          <w:top w:val="none" w:sz="0" w:space="0" w:color="auto"/>
-          <w:left w:val="none" w:sz="0" w:space="0" w:color="auto"/>
-          <w:bottom w:val="none" w:sz="0" w:space="0" w:color="auto"/>
-          <w:right w:val="none" w:sz="0" w:space="0" w:color="auto"/>
-          <w:between w:val="none" w:sz="0" w:space="0" w:color="auto"/>
-          <w:bar w:val="none" w:sz="0" w:color="auto"/>
-        </w:pBdr>
-        <w:autoSpaceDE w:val="0"/>
-        <w:autoSpaceDN w:val="0"/>
-        <w:adjustRightInd w:val="0"/>
-        <w:rPr>
-          <w:lang w:val="en-GB" w:eastAsia="zh-CN"/>
+        <w:rPr>
+          <w:rFonts w:ascii="Times New Roman" w:eastAsia="Times New Roman" w:hAnsi="Times New Roman" w:cs="Times New Roman"/>
+          <w:b/>
+          <w:bCs/>
+          <w:kern w:val="0"/>
         </w:rPr>
       </w:pPr>
       <w:r>
         <w:rPr>
-          <w:lang w:val="en-GB" w:eastAsia="zh-CN"/>
-        </w:rPr>
-        <w:t>Group Dashboard – overview of group members, upcoming deadlines, recent activity, and quick access to group tools</w:t>
-      </w:r>
-      <w:r>
-        <w:rPr>
-          <w:lang w:val="en-GB" w:eastAsia="zh-CN"/>
-        </w:rPr>
-        <w:t>.</w:t>
+          <w:rFonts w:ascii="Arial" w:hAnsi="Arial" w:cs="Arial"/>
+          <w:color w:val="0C1014"/>
+          <w:sz w:val="23"/>
+          <w:szCs w:val="23"/>
+        </w:rPr>
+        <w:t xml:space="preserve">group dashboard </w:t>
       </w:r>
     </w:p>
     <w:p>
       <w:pPr>
-        <w:pStyle w:val="ListParagraph"/>
+        <w:pStyle w:val="BodyA"/>
         <w:numPr>
           <w:ilvl w:val="0"/>
-          <w:numId w:val="4"/>
+          <w:numId w:val="3"/>
         </w:numPr>
-        <w:pBdr>
-          <w:top w:val="none" w:sz="0" w:space="0" w:color="auto"/>
-          <w:left w:val="none" w:sz="0" w:space="0" w:color="auto"/>
-          <w:bottom w:val="none" w:sz="0" w:space="0" w:color="auto"/>
-          <w:right w:val="none" w:sz="0" w:space="0" w:color="auto"/>
-          <w:between w:val="none" w:sz="0" w:space="0" w:color="auto"/>
-          <w:bar w:val="none" w:sz="0" w:color="auto"/>
-        </w:pBdr>
-        <w:autoSpaceDE w:val="0"/>
-        <w:autoSpaceDN w:val="0"/>
-        <w:adjustRightInd w:val="0"/>
-        <w:rPr>
-          <w:lang w:val="en-GB" w:eastAsia="zh-CN"/>
+        <w:rPr>
+          <w:rFonts w:ascii="Times New Roman" w:eastAsia="Times New Roman" w:hAnsi="Times New Roman" w:cs="Times New Roman"/>
+          <w:b/>
+          <w:bCs/>
+          <w:kern w:val="0"/>
         </w:rPr>
       </w:pPr>
       <w:r>
         <w:rPr>
-          <w:lang w:val="en-GB" w:eastAsia="zh-CN"/>
-        </w:rPr>
-        <w:t>Group Chat – real-time messaging for discussion and coordination</w:t>
-      </w:r>
-      <w:r>
-        <w:rPr>
-          <w:lang w:val="en-GB" w:eastAsia="zh-CN"/>
-        </w:rPr>
-        <w:t>.</w:t>
+          <w:rFonts w:ascii="Arial" w:hAnsi="Arial" w:cs="Arial"/>
+          <w:color w:val="0C1014"/>
+          <w:sz w:val="23"/>
+          <w:szCs w:val="23"/>
+        </w:rPr>
+        <w:t>group chat</w:t>
       </w:r>
     </w:p>
     <w:p>
       <w:pPr>
-        <w:pStyle w:val="ListParagraph"/>
+        <w:pStyle w:val="BodyA"/>
         <w:numPr>
           <w:ilvl w:val="0"/>
-          <w:numId w:val="4"/>
+          <w:numId w:val="3"/>
         </w:numPr>
-        <w:pBdr>
-          <w:top w:val="none" w:sz="0" w:space="0" w:color="auto"/>
-          <w:left w:val="none" w:sz="0" w:space="0" w:color="auto"/>
-          <w:bottom w:val="none" w:sz="0" w:space="0" w:color="auto"/>
-          <w:right w:val="none" w:sz="0" w:space="0" w:color="auto"/>
-          <w:between w:val="none" w:sz="0" w:space="0" w:color="auto"/>
-          <w:bar w:val="none" w:sz="0" w:color="auto"/>
-        </w:pBdr>
-        <w:autoSpaceDE w:val="0"/>
-        <w:autoSpaceDN w:val="0"/>
-        <w:adjustRightInd w:val="0"/>
-        <w:rPr>
-          <w:lang w:val="en-GB" w:eastAsia="zh-CN"/>
+        <w:rPr>
+          <w:rFonts w:ascii="Times New Roman" w:eastAsia="Times New Roman" w:hAnsi="Times New Roman" w:cs="Times New Roman"/>
+          <w:b/>
+          <w:bCs/>
+          <w:kern w:val="0"/>
         </w:rPr>
       </w:pPr>
       <w:r>
         <w:rPr>
-          <w:lang w:val="en-GB" w:eastAsia="zh-CN"/>
-        </w:rPr>
-        <w:t>Task Management Board – a simple Kanban/Jira-style board where tasks can be created, assigned to members, and moved between stages (e.g., To Do, In Progress, Completed)</w:t>
-      </w:r>
-      <w:r>
-        <w:rPr>
-          <w:lang w:val="en-GB" w:eastAsia="zh-CN"/>
-        </w:rPr>
-        <w:t>.</w:t>
+          <w:rFonts w:ascii="Arial" w:hAnsi="Arial" w:cs="Arial"/>
+          <w:color w:val="0C1014"/>
+          <w:sz w:val="23"/>
+          <w:szCs w:val="23"/>
+        </w:rPr>
+        <w:t xml:space="preserve">task management board (like Jira) </w:t>
       </w:r>
     </w:p>
     <w:p>
       <w:pPr>
-        <w:pStyle w:val="ListParagraph"/>
+        <w:pStyle w:val="BodyA"/>
         <w:numPr>
           <w:ilvl w:val="0"/>
-          <w:numId w:val="4"/>
+          <w:numId w:val="3"/>
         </w:numPr>
-        <w:pBdr>
-          <w:top w:val="none" w:sz="0" w:space="0" w:color="auto"/>
-          <w:left w:val="none" w:sz="0" w:space="0" w:color="auto"/>
-          <w:bottom w:val="none" w:sz="0" w:space="0" w:color="auto"/>
-          <w:right w:val="none" w:sz="0" w:space="0" w:color="auto"/>
-          <w:between w:val="none" w:sz="0" w:space="0" w:color="auto"/>
-          <w:bar w:val="none" w:sz="0" w:color="auto"/>
-        </w:pBdr>
-        <w:autoSpaceDE w:val="0"/>
-        <w:autoSpaceDN w:val="0"/>
-        <w:adjustRightInd w:val="0"/>
-        <w:rPr>
-          <w:lang w:val="en-GB" w:eastAsia="zh-CN"/>
+        <w:rPr>
+          <w:rFonts w:ascii="Times New Roman" w:eastAsia="Times New Roman" w:hAnsi="Times New Roman" w:cs="Times New Roman"/>
+          <w:b/>
+          <w:bCs/>
+          <w:kern w:val="0"/>
         </w:rPr>
       </w:pPr>
       <w:r>
         <w:rPr>
-          <w:lang w:val="en-GB" w:eastAsia="zh-CN"/>
-        </w:rPr>
-        <w:t>File Sharing Section – a space where group members can upload, download, and organise shared documents</w:t>
+          <w:rFonts w:ascii="Arial" w:hAnsi="Arial" w:cs="Arial"/>
+          <w:color w:val="0C1014"/>
+          <w:sz w:val="23"/>
+          <w:szCs w:val="23"/>
+        </w:rPr>
+        <w:t>f</w:t>
       </w:r>
       <w:r>
         <w:rPr>
-          <w:lang w:val="en-GB" w:eastAsia="zh-CN"/>
-        </w:rPr>
-        <w:t>.</w:t>
+          <w:rFonts w:ascii="Arial" w:hAnsi="Arial" w:cs="Arial"/>
+          <w:color w:val="0C1014"/>
+          <w:sz w:val="23"/>
+          <w:szCs w:val="23"/>
+        </w:rPr>
+        <w:t xml:space="preserve">ile sharing section </w:t>
       </w:r>
     </w:p>
     <w:p>
       <w:pPr>
-        <w:pStyle w:val="ListParagraph"/>
+        <w:pStyle w:val="BodyA"/>
         <w:numPr>
           <w:ilvl w:val="0"/>
-          <w:numId w:val="4"/>
+          <w:numId w:val="3"/>
         </w:numPr>
-        <w:pBdr>
-          <w:top w:val="none" w:sz="0" w:space="0" w:color="auto"/>
-          <w:left w:val="none" w:sz="0" w:space="0" w:color="auto"/>
-          <w:bottom w:val="none" w:sz="0" w:space="0" w:color="auto"/>
-          <w:right w:val="none" w:sz="0" w:space="0" w:color="auto"/>
-          <w:between w:val="none" w:sz="0" w:space="0" w:color="auto"/>
-          <w:bar w:val="none" w:sz="0" w:color="auto"/>
-        </w:pBdr>
-        <w:autoSpaceDE w:val="0"/>
-        <w:autoSpaceDN w:val="0"/>
-        <w:adjustRightInd w:val="0"/>
-        <w:rPr>
-          <w:lang w:val="en-GB" w:eastAsia="zh-CN"/>
+        <w:rPr>
+          <w:rFonts w:ascii="Times New Roman" w:eastAsia="Times New Roman" w:hAnsi="Times New Roman" w:cs="Times New Roman"/>
+          <w:b/>
+          <w:bCs/>
+          <w:kern w:val="0"/>
         </w:rPr>
       </w:pPr>
       <w:r>
         <w:rPr>
-          <w:lang w:val="en-GB" w:eastAsia="zh-CN"/>
-        </w:rPr>
-        <w:t>AI Meeting Summary Feature (Unique Feature) – an integrated AI tool that automatically summarises meeting discussions or chat messages into key points, action items, and assigned tasks to help students keep track of decisions and responsibilities</w:t>
-      </w:r>
-      <w:r>
-        <w:rPr>
-          <w:lang w:val="en-GB" w:eastAsia="zh-CN"/>
-        </w:rPr>
-        <w:t>.</w:t>
+          <w:rFonts w:ascii="Arial" w:hAnsi="Arial" w:cs="Arial"/>
+          <w:color w:val="0C1014"/>
+          <w:sz w:val="23"/>
+          <w:szCs w:val="23"/>
+        </w:rPr>
+        <w:t>AI meeting summary feature</w:t>
       </w:r>
     </w:p>
     <w:p>
       <w:pPr>
-        <w:pStyle w:val="ListParagraph"/>
-        <w:pBdr>
-          <w:top w:val="none" w:sz="0" w:space="0" w:color="auto"/>
-          <w:left w:val="none" w:sz="0" w:space="0" w:color="auto"/>
-          <w:bottom w:val="none" w:sz="0" w:space="0" w:color="auto"/>
-          <w:right w:val="none" w:sz="0" w:space="0" w:color="auto"/>
-          <w:between w:val="none" w:sz="0" w:space="0" w:color="auto"/>
-          <w:bar w:val="none" w:sz="0" w:color="auto"/>
-        </w:pBdr>
-        <w:autoSpaceDE w:val="0"/>
-        <w:autoSpaceDN w:val="0"/>
-        <w:adjustRightInd w:val="0"/>
-        <w:rPr>
-          <w:lang w:val="en-GB" w:eastAsia="zh-CN"/>
+        <w:pStyle w:val="BodyA"/>
+        <w:rPr>
+          <w:rFonts w:ascii="Times New Roman" w:eastAsia="Times New Roman" w:hAnsi="Times New Roman" w:cs="Times New Roman"/>
+          <w:b/>
+          <w:bCs/>
+          <w:kern w:val="0"/>
         </w:rPr>
       </w:pPr>
     </w:p>
@@ -3437,55 +3349,13 @@
       </w:pPr>
       <w:r>
         <w:rPr>
-          <w:rFonts w:ascii="Times New Roman" w:hAnsi="Times New Roman" w:cs="Times New Roman"/>
-          <w:lang w:val="en-GB"/>
-        </w:rPr>
-        <w:t>The design should be clean, minimal, and intuitive</w:t>
+          <w:rFonts w:ascii="Arial" w:hAnsi="Arial" w:cs="Arial"/>
+          <w:color w:val="0C1014"/>
+          <w:sz w:val="23"/>
+          <w:szCs w:val="23"/>
+        </w:rPr>
+        <w:t>Keep the design clean and simple for usability testing.</w:t>
       </w:r>
-      <w:r>
-        <w:rPr>
-          <w:rFonts w:ascii="Times New Roman" w:hAnsi="Times New Roman" w:cs="Times New Roman"/>
-          <w:b/>
-          <w:bCs/>
-          <w:lang w:val="en-GB"/>
-        </w:rPr>
-        <w:t>,</w:t>
-      </w:r>
-      <w:r>
-        <w:rPr>
-          <w:rFonts w:ascii="Times New Roman" w:hAnsi="Times New Roman" w:cs="Times New Roman"/>
-          <w:lang w:val="en-GB"/>
-        </w:rPr>
-        <w:t xml:space="preserve"> suitable for quick usability testing and</w:t>
-      </w:r>
-      <w:r>
-        <w:rPr>
-          <w:rFonts w:ascii="Times New Roman" w:hAnsi="Times New Roman" w:cs="Times New Roman"/>
-          <w:b/>
-          <w:bCs/>
-          <w:lang w:val="en-GB"/>
-        </w:rPr>
-        <w:t xml:space="preserve"> </w:t>
-      </w:r>
-      <w:r>
-        <w:rPr>
-          <w:rFonts w:ascii="Times New Roman" w:hAnsi="Times New Roman" w:cs="Times New Roman"/>
-          <w:lang w:val="en-GB"/>
-        </w:rPr>
-        <w:t>early-stage prototyping. Focus on simple layouts, clear navigation, and essential functionality rather than visual polish.</w:t>
-      </w:r>
-    </w:p>
-    <w:p>
-      <w:pPr>
-        <w:pStyle w:val="BodyA"/>
-        <w:rPr>
-          <w:rStyle w:val="None"/>
-          <w:rFonts w:ascii="Times New Roman" w:eastAsia="Times New Roman" w:hAnsi="Times New Roman" w:cs="Times New Roman"/>
-          <w:b/>
-          <w:bCs/>
-          <w:kern w:val="0"/>
-        </w:rPr>
-      </w:pPr>
     </w:p>
     <w:p>
       <w:pPr>

</xml_diff>

<commit_message>
changes to advantages and disadvantages for gpt and claude
</commit_message>
<xml_diff>
--- a/INFO2222-ProjectTemplate-P1.docx
+++ b/INFO2222-ProjectTemplate-P1.docx
@@ -216,7 +216,7 @@
           </w:tcPr>
           <w:p>
             <w:pPr>
-              <w:pStyle w:val="2"/>
+              <w:pStyle w:val="Heading2"/>
               <w:spacing w:before="0" w:after="0" w:line="270" w:lineRule="atLeast"/>
               <w:ind w:left="75" w:right="105"/>
             </w:pPr>
@@ -743,11 +743,19 @@
               <w:pStyle w:val="BodyA"/>
               <w:jc w:val="both"/>
             </w:pPr>
+            <w:proofErr w:type="spellStart"/>
             <w:r>
               <w:rPr>
                 <w:rFonts w:ascii="Times New Roman" w:hAnsi="Times New Roman"/>
               </w:rPr>
-              <w:t>Seonghyun Kim</w:t>
+              <w:t>Seonghyun</w:t>
+            </w:r>
+            <w:proofErr w:type="spellEnd"/>
+            <w:r>
+              <w:rPr>
+                <w:rFonts w:ascii="Times New Roman" w:hAnsi="Times New Roman"/>
+              </w:rPr>
+              <w:t xml:space="preserve"> Kim</w:t>
             </w:r>
           </w:p>
         </w:tc>
@@ -1697,7 +1705,7 @@
             <w:hyperlink r:id="rId11" w:history="1">
               <w:r>
                 <w:rPr>
-                  <w:rStyle w:val="a3"/>
+                  <w:rStyle w:val="Hyperlink"/>
                   <w:lang w:val="en-AU"/>
                 </w:rPr>
                 <w:t>https://gemini.google.com/app?hl=en-AU</w:t>
@@ -1787,7 +1795,7 @@
             <w:hyperlink r:id="rId12" w:history="1">
               <w:r>
                 <w:rPr>
-                  <w:rStyle w:val="a3"/>
+                  <w:rStyle w:val="Hyperlink"/>
                 </w:rPr>
                 <w:t>https://firefly.adobe.com/?media=featured</w:t>
               </w:r>
@@ -2074,13 +2082,151 @@
                 <w:rStyle w:val="None"/>
               </w:rPr>
             </w:pPr>
+            <w:proofErr w:type="spellStart"/>
             <w:r>
               <w:rPr>
                 <w:rStyle w:val="None"/>
                 <w:lang w:val="ko-KR" w:eastAsia="ko-KR"/>
               </w:rPr>
-              <w:t xml:space="preserve">This is code based web platform so it is </w:t>
-            </w:r>
+              <w:t>This</w:t>
+            </w:r>
+            <w:proofErr w:type="spellEnd"/>
+            <w:r>
+              <w:rPr>
+                <w:rStyle w:val="None"/>
+                <w:lang w:val="ko-KR" w:eastAsia="ko-KR"/>
+              </w:rPr>
+              <w:t xml:space="preserve"> </w:t>
+            </w:r>
+            <w:proofErr w:type="spellStart"/>
+            <w:r>
+              <w:rPr>
+                <w:rStyle w:val="None"/>
+                <w:lang w:val="ko-KR" w:eastAsia="ko-KR"/>
+              </w:rPr>
+              <w:t>is</w:t>
+            </w:r>
+            <w:proofErr w:type="spellEnd"/>
+            <w:r>
+              <w:rPr>
+                <w:rStyle w:val="None"/>
+                <w:lang w:val="ko-KR" w:eastAsia="ko-KR"/>
+              </w:rPr>
+              <w:t xml:space="preserve"> </w:t>
+            </w:r>
+            <w:proofErr w:type="spellStart"/>
+            <w:r>
+              <w:rPr>
+                <w:rStyle w:val="None"/>
+                <w:lang w:val="ko-KR" w:eastAsia="ko-KR"/>
+              </w:rPr>
+              <w:t>code</w:t>
+            </w:r>
+            <w:proofErr w:type="spellEnd"/>
+            <w:r>
+              <w:rPr>
+                <w:rStyle w:val="None"/>
+                <w:lang w:val="ko-KR" w:eastAsia="ko-KR"/>
+              </w:rPr>
+              <w:t xml:space="preserve"> </w:t>
+            </w:r>
+            <w:proofErr w:type="spellStart"/>
+            <w:r>
+              <w:rPr>
+                <w:rStyle w:val="None"/>
+                <w:lang w:val="ko-KR" w:eastAsia="ko-KR"/>
+              </w:rPr>
+              <w:t>based</w:t>
+            </w:r>
+            <w:proofErr w:type="spellEnd"/>
+            <w:r>
+              <w:rPr>
+                <w:rStyle w:val="None"/>
+                <w:lang w:val="ko-KR" w:eastAsia="ko-KR"/>
+              </w:rPr>
+              <w:t xml:space="preserve"> </w:t>
+            </w:r>
+            <w:proofErr w:type="spellStart"/>
+            <w:r>
+              <w:rPr>
+                <w:rStyle w:val="None"/>
+                <w:lang w:val="ko-KR" w:eastAsia="ko-KR"/>
+              </w:rPr>
+              <w:t>web</w:t>
+            </w:r>
+            <w:proofErr w:type="spellEnd"/>
+            <w:r>
+              <w:rPr>
+                <w:rStyle w:val="None"/>
+                <w:lang w:val="ko-KR" w:eastAsia="ko-KR"/>
+              </w:rPr>
+              <w:t xml:space="preserve"> </w:t>
+            </w:r>
+            <w:proofErr w:type="spellStart"/>
+            <w:r>
+              <w:rPr>
+                <w:rStyle w:val="None"/>
+                <w:lang w:val="ko-KR" w:eastAsia="ko-KR"/>
+              </w:rPr>
+              <w:t>platform</w:t>
+            </w:r>
+            <w:proofErr w:type="spellEnd"/>
+            <w:r>
+              <w:rPr>
+                <w:rStyle w:val="None"/>
+                <w:lang w:val="ko-KR" w:eastAsia="ko-KR"/>
+              </w:rPr>
+              <w:t xml:space="preserve"> </w:t>
+            </w:r>
+            <w:proofErr w:type="spellStart"/>
+            <w:r>
+              <w:rPr>
+                <w:rStyle w:val="None"/>
+                <w:lang w:val="ko-KR" w:eastAsia="ko-KR"/>
+              </w:rPr>
+              <w:t>so</w:t>
+            </w:r>
+            <w:proofErr w:type="spellEnd"/>
+            <w:r>
+              <w:rPr>
+                <w:rStyle w:val="None"/>
+                <w:lang w:val="ko-KR" w:eastAsia="ko-KR"/>
+              </w:rPr>
+              <w:t xml:space="preserve"> </w:t>
+            </w:r>
+            <w:proofErr w:type="spellStart"/>
+            <w:r>
+              <w:rPr>
+                <w:rStyle w:val="None"/>
+                <w:lang w:val="ko-KR" w:eastAsia="ko-KR"/>
+              </w:rPr>
+              <w:t>it</w:t>
+            </w:r>
+            <w:proofErr w:type="spellEnd"/>
+            <w:r>
+              <w:rPr>
+                <w:rStyle w:val="None"/>
+                <w:lang w:val="ko-KR" w:eastAsia="ko-KR"/>
+              </w:rPr>
+              <w:t xml:space="preserve"> </w:t>
+            </w:r>
+            <w:proofErr w:type="spellStart"/>
+            <w:r>
+              <w:rPr>
+                <w:rStyle w:val="None"/>
+                <w:lang w:val="ko-KR" w:eastAsia="ko-KR"/>
+              </w:rPr>
+              <w:t>is</w:t>
+            </w:r>
+            <w:proofErr w:type="spellEnd"/>
+            <w:r>
+              <w:rPr>
+                <w:rStyle w:val="None"/>
+                <w:lang w:val="ko-KR" w:eastAsia="ko-KR"/>
+              </w:rPr>
+              <w:t xml:space="preserve"> </w:t>
+            </w:r>
+            <w:proofErr w:type="spellStart"/>
             <w:r>
               <w:rPr>
                 <w:rStyle w:val="None"/>
@@ -2093,6 +2239,7 @@
               </w:rPr>
               <w:t>available</w:t>
             </w:r>
+            <w:proofErr w:type="spellEnd"/>
             <w:r>
               <w:rPr>
                 <w:rStyle w:val="None"/>
@@ -2140,7 +2287,31 @@
                   <w14:miter w14:lim="400000"/>
                 </w14:textOutline>
               </w:rPr>
-              <w:t>(title, name, etc)</w:t>
+              <w:t xml:space="preserve">(title, name, </w:t>
+            </w:r>
+            <w:proofErr w:type="spellStart"/>
+            <w:r>
+              <w:rPr>
+                <w:rStyle w:val="None"/>
+                <w14:textOutline w14:w="12700" w14:cap="flat" w14:cmpd="sng" w14:algn="ctr">
+                  <w14:noFill/>
+                  <w14:prstDash w14:val="solid"/>
+                  <w14:miter w14:lim="400000"/>
+                </w14:textOutline>
+              </w:rPr>
+              <w:t>etc</w:t>
+            </w:r>
+            <w:proofErr w:type="spellEnd"/>
+            <w:r>
+              <w:rPr>
+                <w:rStyle w:val="None"/>
+                <w14:textOutline w14:w="12700" w14:cap="flat" w14:cmpd="sng" w14:algn="ctr">
+                  <w14:noFill/>
+                  <w14:prstDash w14:val="solid"/>
+                  <w14:miter w14:lim="400000"/>
+                </w14:textOutline>
+              </w:rPr>
+              <w:t>)</w:t>
             </w:r>
           </w:p>
         </w:tc>
@@ -2347,6 +2518,7 @@
                 <w:lang w:val="ko-KR" w:eastAsia="ko-KR"/>
               </w:rPr>
             </w:pPr>
+            <w:proofErr w:type="spellStart"/>
             <w:r>
               <w:rPr>
                 <w:rStyle w:val="None"/>
@@ -2357,7 +2529,46 @@
                   <w14:miter w14:lim="400000"/>
                 </w14:textOutline>
               </w:rPr>
-              <w:t xml:space="preserve">Too simple and </w:t>
+              <w:t>Too</w:t>
+            </w:r>
+            <w:proofErr w:type="spellEnd"/>
+            <w:r>
+              <w:rPr>
+                <w:rStyle w:val="None"/>
+                <w:lang w:val="ko-KR" w:eastAsia="ko-KR"/>
+                <w14:textOutline w14:w="12700" w14:cap="flat" w14:cmpd="sng" w14:algn="ctr">
+                  <w14:noFill/>
+                  <w14:prstDash w14:val="solid"/>
+                  <w14:miter w14:lim="400000"/>
+                </w14:textOutline>
+              </w:rPr>
+              <w:t xml:space="preserve"> </w:t>
+            </w:r>
+            <w:proofErr w:type="spellStart"/>
+            <w:r>
+              <w:rPr>
+                <w:rStyle w:val="None"/>
+                <w:lang w:val="ko-KR" w:eastAsia="ko-KR"/>
+                <w14:textOutline w14:w="12700" w14:cap="flat" w14:cmpd="sng" w14:algn="ctr">
+                  <w14:noFill/>
+                  <w14:prstDash w14:val="solid"/>
+                  <w14:miter w14:lim="400000"/>
+                </w14:textOutline>
+              </w:rPr>
+              <w:t>simple</w:t>
+            </w:r>
+            <w:proofErr w:type="spellEnd"/>
+            <w:r>
+              <w:rPr>
+                <w:rStyle w:val="None"/>
+                <w:lang w:val="ko-KR" w:eastAsia="ko-KR"/>
+                <w14:textOutline w14:w="12700" w14:cap="flat" w14:cmpd="sng" w14:algn="ctr">
+                  <w14:noFill/>
+                  <w14:prstDash w14:val="solid"/>
+                  <w14:miter w14:lim="400000"/>
+                </w14:textOutline>
+              </w:rPr>
+              <w:t xml:space="preserve"> and </w:t>
             </w:r>
             <w:r>
               <w:rPr>
@@ -2408,8 +2619,45 @@
                   <w14:miter w14:lim="400000"/>
                 </w14:textOutline>
               </w:rPr>
-              <w:t>Lack of colour for each pages</w:t>
-            </w:r>
+              <w:t xml:space="preserve">Lack of </w:t>
+            </w:r>
+            <w:proofErr w:type="spellStart"/>
+            <w:r>
+              <w:rPr>
+                <w:rStyle w:val="None"/>
+                <w14:textOutline w14:w="12700" w14:cap="flat" w14:cmpd="sng" w14:algn="ctr">
+                  <w14:noFill/>
+                  <w14:prstDash w14:val="solid"/>
+                  <w14:miter w14:lim="400000"/>
+                </w14:textOutline>
+              </w:rPr>
+              <w:t>colour</w:t>
+            </w:r>
+            <w:proofErr w:type="spellEnd"/>
+            <w:r>
+              <w:rPr>
+                <w:rStyle w:val="None"/>
+                <w14:textOutline w14:w="12700" w14:cap="flat" w14:cmpd="sng" w14:algn="ctr">
+                  <w14:noFill/>
+                  <w14:prstDash w14:val="solid"/>
+                  <w14:miter w14:lim="400000"/>
+                </w14:textOutline>
+              </w:rPr>
+              <w:t xml:space="preserve"> for each </w:t>
+            </w:r>
+            <w:proofErr w:type="gramStart"/>
+            <w:r>
+              <w:rPr>
+                <w:rStyle w:val="None"/>
+                <w14:textOutline w14:w="12700" w14:cap="flat" w14:cmpd="sng" w14:algn="ctr">
+                  <w14:noFill/>
+                  <w14:prstDash w14:val="solid"/>
+                  <w14:miter w14:lim="400000"/>
+                </w14:textOutline>
+              </w:rPr>
+              <w:t>pages</w:t>
+            </w:r>
+            <w:proofErr w:type="gramEnd"/>
           </w:p>
         </w:tc>
       </w:tr>
@@ -2457,70 +2705,52 @@
           </w:tcPr>
           <w:p>
             <w:pPr>
-              <w:pStyle w:val="a6"/>
+              <w:pStyle w:val="ListParagraph"/>
               <w:numPr>
                 <w:ilvl w:val="0"/>
                 <w:numId w:val="3"/>
               </w:numPr>
             </w:pPr>
             <w:r>
-              <w:t xml:space="preserve">Has the ability to generate highly coherent and great quality </w:t>
-            </w:r>
-            <w:r>
-              <w:t xml:space="preserve">texts/writings. </w:t>
-            </w:r>
-          </w:p>
-          <w:p>
-            <w:pPr>
-              <w:pStyle w:val="a6"/>
+              <w:t>Summaries: e</w:t>
+            </w:r>
+            <w:r>
+              <w:t xml:space="preserve">ffective at condensing lengthy texts into accurate summaries. This would make it useful at the Ai meeting summary feature. </w:t>
+            </w:r>
+          </w:p>
+        </w:tc>
+        <w:tc>
+          <w:tcPr>
+            <w:tcW w:w="4059" w:type="dxa"/>
+            <w:tcBorders>
+              <w:top w:val="single" w:sz="4" w:space="0" w:color="000000"/>
+              <w:left w:val="single" w:sz="4" w:space="0" w:color="000000"/>
+              <w:bottom w:val="single" w:sz="4" w:space="0" w:color="000000"/>
+              <w:right w:val="single" w:sz="4" w:space="0" w:color="000000"/>
+            </w:tcBorders>
+            <w:tcMar>
+              <w:top w:w="80" w:type="dxa"/>
+              <w:left w:w="80" w:type="dxa"/>
+              <w:bottom w:w="80" w:type="dxa"/>
+              <w:right w:w="80" w:type="dxa"/>
+            </w:tcMar>
+          </w:tcPr>
+          <w:p>
+            <w:pPr>
+              <w:pStyle w:val="ListParagraph"/>
               <w:numPr>
                 <w:ilvl w:val="0"/>
                 <w:numId w:val="3"/>
               </w:numPr>
             </w:pPr>
             <w:r>
-              <w:t xml:space="preserve">Effective at condensing lengthy texts into accurate summaries. This would make it useful at the Ai meeting summary feature. </w:t>
-            </w:r>
-          </w:p>
-        </w:tc>
-        <w:tc>
-          <w:tcPr>
-            <w:tcW w:w="4059" w:type="dxa"/>
-            <w:tcBorders>
-              <w:top w:val="single" w:sz="4" w:space="0" w:color="000000"/>
-              <w:left w:val="single" w:sz="4" w:space="0" w:color="000000"/>
-              <w:bottom w:val="single" w:sz="4" w:space="0" w:color="000000"/>
-              <w:right w:val="single" w:sz="4" w:space="0" w:color="000000"/>
-            </w:tcBorders>
-            <w:tcMar>
-              <w:top w:w="80" w:type="dxa"/>
-              <w:left w:w="80" w:type="dxa"/>
-              <w:bottom w:w="80" w:type="dxa"/>
-              <w:right w:w="80" w:type="dxa"/>
-            </w:tcMar>
-          </w:tcPr>
-          <w:p>
-            <w:pPr>
-              <w:pStyle w:val="a6"/>
-              <w:numPr>
-                <w:ilvl w:val="0"/>
-                <w:numId w:val="3"/>
-              </w:numPr>
-            </w:pPr>
-            <w:r>
-              <w:t>Lacks flexibility at producing necessary technical features for the prototype. It is not the best GenAi at generating interactive prototypes and application programming interfaces.</w:t>
-            </w:r>
-          </w:p>
-          <w:p>
-            <w:pPr>
-              <w:pStyle w:val="a6"/>
-              <w:numPr>
-                <w:ilvl w:val="0"/>
-                <w:numId w:val="3"/>
-              </w:numPr>
-            </w:pPr>
-            <w:r>
-              <w:t xml:space="preserve">Not design-oriented, making it lack ability to generate appealing visuals. Instead, it often uses similar generic designs and layouts without detailed prompts and ongoing feedback. </w:t>
+              <w:t>Not design-oriented</w:t>
+            </w:r>
+            <w:r>
+              <w:t xml:space="preserve">: </w:t>
+            </w:r>
+            <w:r>
+              <w:t xml:space="preserve">making it lack ability to generate appealing visuals. Instead, it often uses similar generic designs and layouts without detailed prompts and ongoing feedback. </w:t>
             </w:r>
           </w:p>
         </w:tc>
@@ -2547,7 +2777,6 @@
           </w:tcPr>
           <w:p>
             <w:r>
-              <w:lastRenderedPageBreak/>
               <w:t xml:space="preserve">ChatGPT </w:t>
             </w:r>
           </w:p>
@@ -2570,7 +2799,7 @@
           </w:tcPr>
           <w:p>
             <w:pPr>
-              <w:pStyle w:val="a6"/>
+              <w:pStyle w:val="ListParagraph"/>
               <w:numPr>
                 <w:ilvl w:val="0"/>
                 <w:numId w:val="3"/>
@@ -2580,63 +2809,57 @@
               <w:rPr>
                 <w:lang w:val="en-GB" w:eastAsia="zh-CN"/>
               </w:rPr>
-              <w:t xml:space="preserve">Effective at combining all necessary features of prototyping – interface design, code and explanation of prototype functions/abilities. This makes it an efficient GenAI for generating a complete prototype. </w:t>
-            </w:r>
-          </w:p>
-          <w:p>
-            <w:pPr>
-              <w:pStyle w:val="a6"/>
+              <w:t xml:space="preserve">UI features: </w:t>
+            </w:r>
+            <w:r>
+              <w:rPr>
+                <w:lang w:val="en-GB" w:eastAsia="zh-CN"/>
+              </w:rPr>
+              <w:t xml:space="preserve">Capable of generating complete user interface flows between features (dashboard, chats, etc.). As it can create and </w:t>
+            </w:r>
+            <w:r>
+              <w:rPr>
+                <w:lang w:val="en-GB" w:eastAsia="zh-CN"/>
+              </w:rPr>
+              <w:lastRenderedPageBreak/>
+              <w:t>handle multi-screen/feature systems coherently, which is necessary for implementing this system.</w:t>
+            </w:r>
+          </w:p>
+        </w:tc>
+        <w:tc>
+          <w:tcPr>
+            <w:tcW w:w="4059" w:type="dxa"/>
+            <w:tcBorders>
+              <w:top w:val="single" w:sz="4" w:space="0" w:color="000000"/>
+              <w:left w:val="single" w:sz="4" w:space="0" w:color="000000"/>
+              <w:bottom w:val="single" w:sz="4" w:space="0" w:color="000000"/>
+              <w:right w:val="single" w:sz="4" w:space="0" w:color="000000"/>
+            </w:tcBorders>
+            <w:tcMar>
+              <w:top w:w="80" w:type="dxa"/>
+              <w:left w:w="80" w:type="dxa"/>
+              <w:bottom w:w="80" w:type="dxa"/>
+              <w:right w:w="80" w:type="dxa"/>
+            </w:tcMar>
+          </w:tcPr>
+          <w:p>
+            <w:pPr>
+              <w:pStyle w:val="ListParagraph"/>
               <w:numPr>
                 <w:ilvl w:val="0"/>
                 <w:numId w:val="3"/>
               </w:numPr>
             </w:pPr>
             <w:r>
-              <w:rPr>
-                <w:lang w:val="en-GB" w:eastAsia="zh-CN"/>
-              </w:rPr>
-              <w:t>Capable of generating complete user interface flows between features (dashboard, chats, etc.). As it can create and handle multi-screen/feature systems coherently, which is necessary for implementing this system.</w:t>
-            </w:r>
-          </w:p>
-        </w:tc>
-        <w:tc>
-          <w:tcPr>
-            <w:tcW w:w="4059" w:type="dxa"/>
-            <w:tcBorders>
-              <w:top w:val="single" w:sz="4" w:space="0" w:color="000000"/>
-              <w:left w:val="single" w:sz="4" w:space="0" w:color="000000"/>
-              <w:bottom w:val="single" w:sz="4" w:space="0" w:color="000000"/>
-              <w:right w:val="single" w:sz="4" w:space="0" w:color="000000"/>
-            </w:tcBorders>
-            <w:tcMar>
-              <w:top w:w="80" w:type="dxa"/>
-              <w:left w:w="80" w:type="dxa"/>
-              <w:bottom w:w="80" w:type="dxa"/>
-              <w:right w:w="80" w:type="dxa"/>
-            </w:tcMar>
-          </w:tcPr>
-          <w:p>
-            <w:pPr>
-              <w:pStyle w:val="a6"/>
-              <w:numPr>
-                <w:ilvl w:val="0"/>
-                <w:numId w:val="3"/>
-              </w:numPr>
-            </w:pPr>
-            <w:r>
-              <w:t>Possibility of “hallucinating” features and functions that were not prompted or wanted. This may result in inconsistent logic and unfunctional code that is difficult to debug.</w:t>
-            </w:r>
-          </w:p>
-          <w:p>
-            <w:pPr>
-              <w:pStyle w:val="a6"/>
-              <w:numPr>
-                <w:ilvl w:val="0"/>
-                <w:numId w:val="3"/>
-              </w:numPr>
-            </w:pPr>
-            <w:r>
-              <w:t>Lacks the ability to include visual representations to make the user interface more interactive and appealing to students. This is as it cannot produce prefect-pixel level designs.</w:t>
+              <w:lastRenderedPageBreak/>
+              <w:t xml:space="preserve">Lack of visuals: </w:t>
+            </w:r>
+            <w:r>
+              <w:t xml:space="preserve">Lacks the ability to include visual representations to make the user interface more interactive and appealing to students. This is as it </w:t>
+            </w:r>
+            <w:r>
+              <w:lastRenderedPageBreak/>
+              <w:t>cannot produce prefect-pixel level designs.</w:t>
             </w:r>
           </w:p>
         </w:tc>
@@ -2667,6 +2890,7 @@
                 <w:rFonts w:hint="eastAsia"/>
                 <w:lang w:val="en-AU"/>
               </w:rPr>
+              <w:lastRenderedPageBreak/>
               <w:t>Gemini</w:t>
             </w:r>
           </w:p>
@@ -2689,7 +2913,7 @@
           </w:tcPr>
           <w:p>
             <w:pPr>
-              <w:pStyle w:val="a6"/>
+              <w:pStyle w:val="ListParagraph"/>
               <w:numPr>
                 <w:ilvl w:val="0"/>
                 <w:numId w:val="3"/>
@@ -2751,7 +2975,7 @@
           </w:tcPr>
           <w:p>
             <w:pPr>
-              <w:pStyle w:val="a6"/>
+              <w:pStyle w:val="ListParagraph"/>
               <w:numPr>
                 <w:ilvl w:val="0"/>
                 <w:numId w:val="3"/>
@@ -2831,7 +3055,7 @@
           </w:tcPr>
           <w:p>
             <w:pPr>
-              <w:pStyle w:val="a6"/>
+              <w:pStyle w:val="ListParagraph"/>
               <w:numPr>
                 <w:ilvl w:val="0"/>
                 <w:numId w:val="3"/>
@@ -2867,7 +3091,7 @@
           </w:tcPr>
           <w:p>
             <w:pPr>
-              <w:pStyle w:val="a6"/>
+              <w:pStyle w:val="ListParagraph"/>
               <w:numPr>
                 <w:ilvl w:val="0"/>
                 <w:numId w:val="3"/>
@@ -3420,7 +3644,25 @@
                 <w:rFonts w:ascii="Times New Roman" w:hAnsi="Times New Roman"/>
                 <w:kern w:val="0"/>
               </w:rPr>
-              <w:t>Screenshots (Write a short caption describing the screenshot, along with a USyd GitHub URL with code base for each generated project)</w:t>
+              <w:t xml:space="preserve">Screenshots (Write a short caption describing the screenshot, along with a </w:t>
+            </w:r>
+            <w:proofErr w:type="spellStart"/>
+            <w:r>
+              <w:rPr>
+                <w:rStyle w:val="None"/>
+                <w:rFonts w:ascii="Times New Roman" w:hAnsi="Times New Roman"/>
+                <w:kern w:val="0"/>
+              </w:rPr>
+              <w:t>USyd</w:t>
+            </w:r>
+            <w:proofErr w:type="spellEnd"/>
+            <w:r>
+              <w:rPr>
+                <w:rStyle w:val="None"/>
+                <w:rFonts w:ascii="Times New Roman" w:hAnsi="Times New Roman"/>
+                <w:kern w:val="0"/>
+              </w:rPr>
+              <w:t xml:space="preserve"> GitHub URL with code base for each generated project)</w:t>
             </w:r>
           </w:p>
         </w:tc>
@@ -3504,7 +3746,7 @@
               </w:tabs>
               <w:spacing w:before="0" w:after="160" w:line="278" w:lineRule="auto"/>
               <w:rPr>
-                <w:rFonts w:ascii="等线" w:eastAsia="等线" w:hAnsi="等线" w:cs="等线"/>
+                <w:rFonts w:ascii="DengXian" w:eastAsia="DengXian" w:hAnsi="DengXian" w:cs="DengXian"/>
                 <w:kern w:val="2"/>
                 <w:sz w:val="22"/>
                 <w:szCs w:val="22"/>
@@ -3517,7 +3759,7 @@
             </w:pPr>
             <w:r>
               <w:rPr>
-                <w:rFonts w:ascii="等线" w:eastAsia="等线" w:hAnsi="等线" w:cs="等线"/>
+                <w:rFonts w:ascii="DengXian" w:eastAsia="DengXian" w:hAnsi="DengXian" w:cs="DengXian"/>
                 <w:noProof/>
                 <w:kern w:val="2"/>
                 <w:sz w:val="22"/>
@@ -3577,7 +3819,15 @@
               <w:spacing w:before="0" w:after="240" w:line="240" w:lineRule="auto"/>
             </w:pPr>
             <w:r>
-              <w:t>The dashboard shows team members and provides tools for managing their schedules efficiently and summarises the types of tasks.</w:t>
+              <w:t xml:space="preserve">The dashboard shows team members and provides tools for managing their schedules efficiently and </w:t>
+            </w:r>
+            <w:proofErr w:type="spellStart"/>
+            <w:r>
+              <w:t>summarises</w:t>
+            </w:r>
+            <w:proofErr w:type="spellEnd"/>
+            <w:r>
+              <w:t xml:space="preserve"> the types of tasks.</w:t>
             </w:r>
           </w:p>
           <w:p>
@@ -3639,7 +3889,15 @@
               <w:spacing w:before="0" w:after="240" w:line="240" w:lineRule="auto"/>
             </w:pPr>
             <w:r>
-              <w:t>The task board organises the types of tasks and helps students understand the processes required to complete each one.</w:t>
+              <w:t xml:space="preserve">The task board </w:t>
+            </w:r>
+            <w:proofErr w:type="spellStart"/>
+            <w:r>
+              <w:t>organises</w:t>
+            </w:r>
+            <w:proofErr w:type="spellEnd"/>
+            <w:r>
+              <w:t xml:space="preserve"> the types of tasks and helps students understand the processes required to complete each one.</w:t>
             </w:r>
           </w:p>
           <w:p>
@@ -3806,6 +4064,7 @@
               </w:rPr>
               <w:t xml:space="preserve">Simple interface to </w:t>
             </w:r>
+            <w:proofErr w:type="spellStart"/>
             <w:r>
               <w:rPr>
                 <w:rFonts w:cs="Arial Unicode MS"/>
@@ -3819,6 +4078,7 @@
               </w:rPr>
               <w:t>recognise</w:t>
             </w:r>
+            <w:proofErr w:type="spellEnd"/>
             <w:r>
               <w:rPr>
                 <w:rFonts w:cs="Arial Unicode MS"/>
@@ -4079,7 +4339,15 @@
           </w:p>
           <w:p>
             <w:r>
-              <w:t xml:space="preserve">The dashboard includes all features mentioned in the prompt. Easy readability and clear signposting of all features. Project progress and upcoming deadlines are all visible on first glance, providing simple trackability. </w:t>
+              <w:t xml:space="preserve">The dashboard includes all features mentioned in the prompt. Easy readability and clear signposting of all features. Project progress and upcoming deadlines are all </w:t>
+            </w:r>
+            <w:proofErr w:type="gramStart"/>
+            <w:r>
+              <w:t>visible on first glance, providing</w:t>
+            </w:r>
+            <w:proofErr w:type="gramEnd"/>
+            <w:r>
+              <w:t xml:space="preserve"> simple trackability. </w:t>
             </w:r>
           </w:p>
           <w:p>
@@ -4147,7 +4415,7 @@
             <w:hyperlink r:id="rId21" w:history="1">
               <w:r>
                 <w:rPr>
-                  <w:rStyle w:val="a3"/>
+                  <w:rStyle w:val="Hyperlink"/>
                   <w:color w:val="4472C4" w:themeColor="accent1"/>
                 </w:rPr>
                 <w:t>https://github.sydney.edu.au/INFO2222-2026-S1/PRJ-T02-G04/tree/31dfde7bc09f0b72c7b803f83945100f8ebab4b7/prototypes/Claude</w:t>
@@ -4320,7 +4588,7 @@
             <w:hyperlink r:id="rId24" w:history="1">
               <w:r>
                 <w:rPr>
-                  <w:rStyle w:val="a3"/>
+                  <w:rStyle w:val="Hyperlink"/>
                   <w:color w:val="4472C4" w:themeColor="accent1"/>
                 </w:rPr>
                 <w:t>https://github.sydney.edu.au/INFO2222-2026-S1/PRJ-T02-G04/tree/31dfde7bc09f0b72c7b803f83945100f8ebab4b7/prototypes/ChatGPT</w:t>
@@ -4550,7 +4818,7 @@
             <w:hyperlink r:id="rId27" w:history="1">
               <w:r>
                 <w:rPr>
-                  <w:rStyle w:val="a3"/>
+                  <w:rStyle w:val="Hyperlink"/>
                   <w:lang w:eastAsia="zh-CN"/>
                 </w:rPr>
                 <w:t>https://github.sydney.edu.au/INFO2222-2026-S1/PRJ-T02-G04/tree/main/prototypes/Gemini</w:t>
@@ -4776,8 +5044,13 @@
               <w:lastRenderedPageBreak/>
               <w:t>screenshots. For example, the first two pages both seem to be the login page. Besides, there exist some g</w:t>
             </w:r>
-            <w:r>
-              <w:t>arbled characters</w:t>
+            <w:proofErr w:type="spellStart"/>
+            <w:r>
+              <w:t>arbled</w:t>
+            </w:r>
+            <w:proofErr w:type="spellEnd"/>
+            <w:r>
+              <w:t xml:space="preserve"> characters</w:t>
             </w:r>
             <w:r>
               <w:rPr>
@@ -5175,7 +5448,35 @@
                   <w14:bevel/>
                 </w14:textOutline>
               </w:rPr>
-              <w:t>The design is too simple to use. This can be advantage to minority but it seems that it has no familiar and warm design.</w:t>
+              <w:t xml:space="preserve">The design is too simple to use. This can be advantage to </w:t>
+            </w:r>
+            <w:proofErr w:type="gramStart"/>
+            <w:r>
+              <w:rPr>
+                <w:rFonts w:cs="Arial Unicode MS"/>
+                <w:color w:val="000000"/>
+                <w:u w:color="000000"/>
+                <w14:textOutline w14:w="0" w14:cap="flat" w14:cmpd="sng" w14:algn="ctr">
+                  <w14:noFill/>
+                  <w14:prstDash w14:val="solid"/>
+                  <w14:bevel/>
+                </w14:textOutline>
+              </w:rPr>
+              <w:t>minority</w:t>
+            </w:r>
+            <w:proofErr w:type="gramEnd"/>
+            <w:r>
+              <w:rPr>
+                <w:rFonts w:cs="Arial Unicode MS"/>
+                <w:color w:val="000000"/>
+                <w:u w:color="000000"/>
+                <w14:textOutline w14:w="0" w14:cap="flat" w14:cmpd="sng" w14:algn="ctr">
+                  <w14:noFill/>
+                  <w14:prstDash w14:val="solid"/>
+                  <w14:bevel/>
+                </w14:textOutline>
+              </w:rPr>
+              <w:t xml:space="preserve"> but it seems that it has no familiar and warm design.</w:t>
             </w:r>
           </w:p>
         </w:tc>
@@ -5246,7 +5547,31 @@
           </w:tcPr>
           <w:p>
             <w:r>
-              <w:t xml:space="preserve">The design is easy to follow and clean but colourful which aids in guiding users to more important aspects of the dashboard. The task board interface is well structured, with the priority of tasks an useful feature for users. If the interface included a countdown to the due date, it would aid users in more effective organisation. </w:t>
+              <w:t xml:space="preserve">The design is easy to follow and clean but </w:t>
+            </w:r>
+            <w:proofErr w:type="spellStart"/>
+            <w:r>
+              <w:t>colourful</w:t>
+            </w:r>
+            <w:proofErr w:type="spellEnd"/>
+            <w:r>
+              <w:t xml:space="preserve"> which aids in guiding users to more important aspects of the dashboard. The task board interface is well structured, with the priority of tasks </w:t>
+            </w:r>
+            <w:proofErr w:type="gramStart"/>
+            <w:r>
+              <w:t>an</w:t>
+            </w:r>
+            <w:proofErr w:type="gramEnd"/>
+            <w:r>
+              <w:t xml:space="preserve"> useful feature for users. If the interface included a countdown to the due date, it would aid users in more effective </w:t>
+            </w:r>
+            <w:proofErr w:type="spellStart"/>
+            <w:r>
+              <w:t>organisation</w:t>
+            </w:r>
+            <w:proofErr w:type="spellEnd"/>
+            <w:r>
+              <w:t xml:space="preserve">. </w:t>
             </w:r>
           </w:p>
         </w:tc>
@@ -5317,7 +5642,15 @@
           </w:tcPr>
           <w:p>
             <w:r>
-              <w:t xml:space="preserve">The design is considered boring due to its lack of colour and icons. Additionally, the task management screen is not very effective. Each task does not have a short description entailing what that specific task encompasses. The lack of specific due dates is not a desirable feature. </w:t>
+              <w:t xml:space="preserve">The design is considered boring due to its lack of </w:t>
+            </w:r>
+            <w:proofErr w:type="spellStart"/>
+            <w:r>
+              <w:t>colour</w:t>
+            </w:r>
+            <w:proofErr w:type="spellEnd"/>
+            <w:r>
+              <w:t xml:space="preserve"> and icons. Additionally, the task management screen is not very effective. Each task does not have a short description entailing what that specific task encompasses. The lack of specific due dates is not a desirable feature. </w:t>
             </w:r>
           </w:p>
         </w:tc>
@@ -5498,8 +5831,13 @@
               </w:rPr>
               <w:t>The existing of g</w:t>
             </w:r>
-            <w:r>
-              <w:t>arbled characters</w:t>
+            <w:proofErr w:type="spellStart"/>
+            <w:r>
+              <w:t>arbled</w:t>
+            </w:r>
+            <w:proofErr w:type="spellEnd"/>
+            <w:r>
+              <w:t xml:space="preserve"> characters</w:t>
             </w:r>
             <w:r>
               <w:rPr>
@@ -6093,13 +6431,23 @@
               <w:spacing w:before="100" w:after="100"/>
               <w:outlineLvl w:val="3"/>
             </w:pPr>
+            <w:proofErr w:type="spellStart"/>
             <w:r>
               <w:rPr>
                 <w:rStyle w:val="None"/>
                 <w:rFonts w:ascii="Times New Roman" w:hAnsi="Times New Roman"/>
                 <w:kern w:val="0"/>
               </w:rPr>
-              <w:t>Seonghyun Kim</w:t>
+              <w:t>Seonghyun</w:t>
+            </w:r>
+            <w:proofErr w:type="spellEnd"/>
+            <w:r>
+              <w:rPr>
+                <w:rStyle w:val="None"/>
+                <w:rFonts w:ascii="Times New Roman" w:hAnsi="Times New Roman"/>
+                <w:kern w:val="0"/>
+              </w:rPr>
+              <w:t xml:space="preserve"> Kim</w:t>
             </w:r>
           </w:p>
         </w:tc>
@@ -6477,13 +6825,23 @@
               <w:spacing w:before="100" w:after="100"/>
               <w:outlineLvl w:val="3"/>
             </w:pPr>
+            <w:proofErr w:type="spellStart"/>
             <w:r>
               <w:rPr>
                 <w:rStyle w:val="None"/>
                 <w:rFonts w:ascii="Times New Roman" w:hAnsi="Times New Roman"/>
                 <w:kern w:val="0"/>
               </w:rPr>
-              <w:t>Seonghyun Kim</w:t>
+              <w:t>Seonghyun</w:t>
+            </w:r>
+            <w:proofErr w:type="spellEnd"/>
+            <w:r>
+              <w:rPr>
+                <w:rStyle w:val="None"/>
+                <w:rFonts w:ascii="Times New Roman" w:hAnsi="Times New Roman"/>
+                <w:kern w:val="0"/>
+              </w:rPr>
+              <w:t xml:space="preserve"> Kim</w:t>
             </w:r>
           </w:p>
         </w:tc>
@@ -6837,13 +7195,23 @@
               <w:spacing w:before="100" w:after="100"/>
               <w:outlineLvl w:val="3"/>
             </w:pPr>
+            <w:proofErr w:type="spellStart"/>
             <w:r>
               <w:rPr>
                 <w:rStyle w:val="None"/>
                 <w:rFonts w:ascii="Times New Roman" w:hAnsi="Times New Roman"/>
                 <w:kern w:val="0"/>
               </w:rPr>
-              <w:t>Seonghyun Kim</w:t>
+              <w:t>Seonghyun</w:t>
+            </w:r>
+            <w:proofErr w:type="spellEnd"/>
+            <w:r>
+              <w:rPr>
+                <w:rStyle w:val="None"/>
+                <w:rFonts w:ascii="Times New Roman" w:hAnsi="Times New Roman"/>
+                <w:kern w:val="0"/>
+              </w:rPr>
+              <w:t xml:space="preserve"> Kim</w:t>
             </w:r>
           </w:p>
         </w:tc>
@@ -7204,7 +7572,7 @@
 <w:ftr xmlns:wpc="http://schemas.microsoft.com/office/word/2010/wordprocessingCanvas" xmlns:cx="http://schemas.microsoft.com/office/drawing/2014/chartex" xmlns:cx1="http://schemas.microsoft.com/office/drawing/2015/9/8/chartex" xmlns:cx2="http://schemas.microsoft.com/office/drawing/2015/10/21/chartex" xmlns:cx3="http://schemas.microsoft.com/office/drawing/2016/5/9/chartex" xmlns:cx4="http://schemas.microsoft.com/office/drawing/2016/5/10/chartex" xmlns:cx5="http://schemas.microsoft.com/office/drawing/2016/5/11/chartex" xmlns:cx6="http://schemas.microsoft.com/office/drawing/2016/5/12/chartex" xmlns:cx7="http://schemas.microsoft.com/office/drawing/2016/5/13/chartex" xmlns:cx8="http://schemas.microsoft.com/office/drawing/2016/5/14/chartex" xmlns:mc="http://schemas.openxmlformats.org/markup-compatibility/2006" xmlns:aink="http://schemas.microsoft.com/office/drawing/2016/ink" xmlns:am3d="http://schemas.microsoft.com/office/drawing/2017/model3d" xmlns:o="urn:schemas-microsoft-com:office:office" xmlns:oel="http://schemas.microsoft.com/office/2019/extlst" xmlns:r="http://schemas.openxmlformats.org/officeDocument/2006/relationships" xmlns:m="http://schemas.openxmlformats.org/officeDocument/2006/math" xmlns:v="urn:schemas-microsoft-com:vml" xmlns:wp14="http://schemas.microsoft.com/office/word/2010/wordprocessingDrawing" xmlns:wp="http://schemas.openxmlformats.org/drawingml/2006/wordprocessingDrawing" xmlns:w10="urn:schemas-microsoft-com:office:word" xmlns:w="http://schemas.openxmlformats.org/wordprocessingml/2006/main" xmlns:w14="http://schemas.microsoft.com/office/word/2010/wordml" xmlns:w15="http://schemas.microsoft.com/office/word/2012/wordml" xmlns:w16cex="http://schemas.microsoft.com/office/word/2018/wordml/cex" xmlns:w16cid="http://schemas.microsoft.com/office/word/2016/wordml/cid" xmlns:w16="http://schemas.microsoft.com/office/word/2018/wordml" xmlns:w16du="http://schemas.microsoft.com/office/word/2023/wordml/word16du" xmlns:w16sdtdh="http://schemas.microsoft.com/office/word/2020/wordml/sdtdatahash" xmlns:w16sdtfl="http://schemas.microsoft.com/office/word/2024/wordml/sdtformatlock" xmlns:w16se="http://schemas.microsoft.com/office/word/2015/wordml/symex" xmlns:wpg="http://schemas.microsoft.com/office/word/2010/wordprocessingGroup" xmlns:wpi="http://schemas.microsoft.com/office/word/2010/wordprocessingInk" xmlns:wne="http://schemas.microsoft.com/office/word/2006/wordml" xmlns:wps="http://schemas.microsoft.com/office/word/2010/wordprocessingShape" mc:Ignorable="w14 w15 w16se w16cid w16 w16cex w16sdtdh w16sdtfl w16du wp14">
   <w:p>
     <w:pPr>
-      <w:pStyle w:val="a5"/>
+      <w:pStyle w:val="Footer"/>
       <w:tabs>
         <w:tab w:val="clear" w:pos="9026"/>
         <w:tab w:val="right" w:pos="9000"/>
@@ -7244,7 +7612,7 @@
 <w:hdr xmlns:wpc="http://schemas.microsoft.com/office/word/2010/wordprocessingCanvas" xmlns:cx="http://schemas.microsoft.com/office/drawing/2014/chartex" xmlns:cx1="http://schemas.microsoft.com/office/drawing/2015/9/8/chartex" xmlns:cx2="http://schemas.microsoft.com/office/drawing/2015/10/21/chartex" xmlns:cx3="http://schemas.microsoft.com/office/drawing/2016/5/9/chartex" xmlns:cx4="http://schemas.microsoft.com/office/drawing/2016/5/10/chartex" xmlns:cx5="http://schemas.microsoft.com/office/drawing/2016/5/11/chartex" xmlns:cx6="http://schemas.microsoft.com/office/drawing/2016/5/12/chartex" xmlns:cx7="http://schemas.microsoft.com/office/drawing/2016/5/13/chartex" xmlns:cx8="http://schemas.microsoft.com/office/drawing/2016/5/14/chartex" xmlns:mc="http://schemas.openxmlformats.org/markup-compatibility/2006" xmlns:aink="http://schemas.microsoft.com/office/drawing/2016/ink" xmlns:am3d="http://schemas.microsoft.com/office/drawing/2017/model3d" xmlns:o="urn:schemas-microsoft-com:office:office" xmlns:oel="http://schemas.microsoft.com/office/2019/extlst" xmlns:r="http://schemas.openxmlformats.org/officeDocument/2006/relationships" xmlns:m="http://schemas.openxmlformats.org/officeDocument/2006/math" xmlns:v="urn:schemas-microsoft-com:vml" xmlns:wp14="http://schemas.microsoft.com/office/word/2010/wordprocessingDrawing" xmlns:wp="http://schemas.openxmlformats.org/drawingml/2006/wordprocessingDrawing" xmlns:w10="urn:schemas-microsoft-com:office:word" xmlns:w="http://schemas.openxmlformats.org/wordprocessingml/2006/main" xmlns:w14="http://schemas.microsoft.com/office/word/2010/wordml" xmlns:w15="http://schemas.microsoft.com/office/word/2012/wordml" xmlns:w16cex="http://schemas.microsoft.com/office/word/2018/wordml/cex" xmlns:w16cid="http://schemas.microsoft.com/office/word/2016/wordml/cid" xmlns:w16="http://schemas.microsoft.com/office/word/2018/wordml" xmlns:w16du="http://schemas.microsoft.com/office/word/2023/wordml/word16du" xmlns:w16sdtdh="http://schemas.microsoft.com/office/word/2020/wordml/sdtdatahash" xmlns:w16sdtfl="http://schemas.microsoft.com/office/word/2024/wordml/sdtformatlock" xmlns:w16se="http://schemas.microsoft.com/office/word/2015/wordml/symex" xmlns:wpg="http://schemas.microsoft.com/office/word/2010/wordprocessingGroup" xmlns:wpi="http://schemas.microsoft.com/office/word/2010/wordprocessingInk" xmlns:wne="http://schemas.microsoft.com/office/word/2006/wordml" xmlns:wps="http://schemas.microsoft.com/office/word/2010/wordprocessingShape" mc:Ignorable="w14 w15 w16se w16cid w16 w16cex w16sdtdh w16sdtfl w16du wp14">
   <w:p>
     <w:pPr>
-      <w:pStyle w:val="a4"/>
+      <w:pStyle w:val="Header"/>
       <w:tabs>
         <w:tab w:val="clear" w:pos="9026"/>
         <w:tab w:val="right" w:pos="9000"/>
@@ -8604,7 +8972,7 @@
     <w:lsdException w:name="Unresolved Mention" w:semiHidden="1" w:unhideWhenUsed="1"/>
     <w:lsdException w:name="Smart Link" w:semiHidden="1" w:unhideWhenUsed="1"/>
   </w:latentStyles>
-  <w:style w:type="paragraph" w:default="1" w:styleId="a">
+  <w:style w:type="paragraph" w:default="1" w:styleId="Normal">
     <w:name w:val="Normal"/>
     <w:qFormat/>
     <w:rPr>
@@ -8613,7 +8981,7 @@
       <w:lang w:val="en-US" w:eastAsia="en-US"/>
     </w:rPr>
   </w:style>
-  <w:style w:type="paragraph" w:styleId="2">
+  <w:style w:type="paragraph" w:styleId="Heading2">
     <w:name w:val="heading 2"/>
     <w:uiPriority w:val="9"/>
     <w:unhideWhenUsed/>
@@ -8638,13 +9006,13 @@
       </w14:textOutline>
     </w:rPr>
   </w:style>
-  <w:style w:type="character" w:default="1" w:styleId="a0">
+  <w:style w:type="character" w:default="1" w:styleId="DefaultParagraphFont">
     <w:name w:val="Default Paragraph Font"/>
     <w:uiPriority w:val="1"/>
     <w:semiHidden/>
     <w:unhideWhenUsed/>
   </w:style>
-  <w:style w:type="table" w:default="1" w:styleId="a1">
+  <w:style w:type="table" w:default="1" w:styleId="TableNormal">
     <w:name w:val="Normal Table"/>
     <w:uiPriority w:val="99"/>
     <w:semiHidden/>
@@ -8659,19 +9027,19 @@
       </w:tblCellMar>
     </w:tblPr>
   </w:style>
-  <w:style w:type="numbering" w:default="1" w:styleId="a2">
+  <w:style w:type="numbering" w:default="1" w:styleId="NoList">
     <w:name w:val="No List"/>
     <w:uiPriority w:val="99"/>
     <w:semiHidden/>
     <w:unhideWhenUsed/>
   </w:style>
-  <w:style w:type="character" w:styleId="a3">
+  <w:style w:type="character" w:styleId="Hyperlink">
     <w:name w:val="Hyperlink"/>
     <w:rPr>
       <w:u w:val="single"/>
     </w:rPr>
   </w:style>
-  <w:style w:type="paragraph" w:styleId="a4">
+  <w:style w:type="paragraph" w:styleId="Header">
     <w:name w:val="header"/>
     <w:pPr>
       <w:tabs>
@@ -8689,7 +9057,7 @@
       <w:lang w:val="en-US"/>
     </w:rPr>
   </w:style>
-  <w:style w:type="paragraph" w:styleId="a5">
+  <w:style w:type="paragraph" w:styleId="Footer">
     <w:name w:val="footer"/>
     <w:pPr>
       <w:tabs>
@@ -8761,7 +9129,7 @@
   </w:style>
   <w:style w:type="character" w:customStyle="1" w:styleId="Hyperlink1">
     <w:name w:val="Hyperlink.1"/>
-    <w:basedOn w:val="a3"/>
+    <w:basedOn w:val="Hyperlink"/>
     <w:rPr>
       <w:outline w:val="0"/>
       <w:color w:val="0000FF"/>
@@ -8800,7 +9168,7 @@
   </w:style>
   <w:style w:type="paragraph" w:customStyle="1" w:styleId="p1">
     <w:name w:val="p1"/>
-    <w:basedOn w:val="a"/>
+    <w:basedOn w:val="Normal"/>
     <w:rsid w:val="00913308"/>
     <w:pPr>
       <w:pBdr>
@@ -8820,9 +9188,9 @@
       <w:lang w:val="en-AU" w:eastAsia="zh-CN"/>
     </w:rPr>
   </w:style>
-  <w:style w:type="paragraph" w:styleId="a6">
+  <w:style w:type="paragraph" w:styleId="ListParagraph">
     <w:name w:val="List Paragraph"/>
-    <w:basedOn w:val="a"/>
+    <w:basedOn w:val="Normal"/>
     <w:uiPriority w:val="34"/>
     <w:qFormat/>
     <w:rsid w:val="00913308"/>
@@ -8831,9 +9199,9 @@
       <w:contextualSpacing/>
     </w:pPr>
   </w:style>
-  <w:style w:type="character" w:styleId="a7">
+  <w:style w:type="character" w:styleId="UnresolvedMention">
     <w:name w:val="Unresolved Mention"/>
-    <w:basedOn w:val="a0"/>
+    <w:basedOn w:val="DefaultParagraphFont"/>
     <w:uiPriority w:val="99"/>
     <w:semiHidden/>
     <w:unhideWhenUsed/>
@@ -8843,9 +9211,9 @@
       <w:shd w:val="clear" w:color="auto" w:fill="E1DFDD"/>
     </w:rPr>
   </w:style>
-  <w:style w:type="character" w:styleId="a8">
+  <w:style w:type="character" w:styleId="FollowedHyperlink">
     <w:name w:val="FollowedHyperlink"/>
-    <w:basedOn w:val="a0"/>
+    <w:basedOn w:val="DefaultParagraphFont"/>
     <w:uiPriority w:val="99"/>
     <w:semiHidden/>
     <w:unhideWhenUsed/>

</xml_diff>